<commit_message>
Remove Hack Day Genesis first prize award and update total prize purse to ₹94,000
</commit_message>
<xml_diff>
--- a/hackathon 2026.docx
+++ b/hackathon 2026.docx
@@ -1,8 +1,8 @@
 
 <file path=word/document.xml><?xml version="1.0" encoding="utf-8"?>
-<w:document xmlns:wpc="http://schemas.microsoft.com/office/word/2010/wordprocessingCanvas" xmlns:mc="http://schemas.openxmlformats.org/markup-compatibility/2006" xmlns:o="urn:schemas-microsoft-com:office:office" xmlns:r="http://schemas.openxmlformats.org/officeDocument/2006/relationships" xmlns:m="http://schemas.openxmlformats.org/officeDocument/2006/math" xmlns:v="urn:schemas-microsoft-com:vml" xmlns:wp14="http://schemas.microsoft.com/office/word/2010/wordprocessingDrawing" xmlns:wp="http://schemas.openxmlformats.org/drawingml/2006/wordprocessingDrawing" xmlns:w10="urn:schemas-microsoft-com:office:word" xmlns:w="http://schemas.openxmlformats.org/wordprocessingml/2006/main" xmlns:w14="http://schemas.microsoft.com/office/word/2010/wordml" xmlns:wpg="http://schemas.microsoft.com/office/word/2010/wordprocessingGroup" xmlns:wpi="http://schemas.microsoft.com/office/word/2010/wordprocessingInk" xmlns:wne="http://schemas.microsoft.com/office/word/2006/wordml" xmlns:wps="http://schemas.microsoft.com/office/word/2010/wordprocessingShape" mc:Ignorable="w14 wp14">
+<w:document xmlns:a="http://schemas.openxmlformats.org/drawingml/2006/main" xmlns:ns1="http://schemas.openxmlformats.org/markup-compatibility/2006" xmlns:ns2="http://schemas.microsoft.com/office/word/2010/wordml" xmlns:ns4="http://schemas.microsoft.com/office/word/2010/wordprocessingDrawing" xmlns:ns8="http://schemas.microsoft.com/office/drawing/2010/main" xmlns:pic="http://schemas.openxmlformats.org/drawingml/2006/picture" xmlns:r="http://schemas.openxmlformats.org/officeDocument/2006/relationships" xmlns:w="http://schemas.openxmlformats.org/wordprocessingml/2006/main" xmlns:wp="http://schemas.openxmlformats.org/drawingml/2006/wordprocessingDrawing" ns1:Ignorable="w14 wp14">
   <w:body>
-    <w:p>
+    <w:p ns2:paraId="447EF09D" ns2:textId="29A8C8C1">
       <w:pPr>
         <w:pStyle w:val="Heading1"/>
         <w:ind w:right="520"/>
@@ -24,7 +24,7 @@
           <w:lang w:val="en-IN" w:eastAsia="en-IN"/>
         </w:rPr>
         <w:drawing>
-          <wp:anchor distT="0" distB="0" distL="114300" distR="114300" simplePos="0" relativeHeight="251658240" behindDoc="0" locked="0" layoutInCell="1" allowOverlap="1" wp14:anchorId="4B2A4C3C" wp14:editId="743085A4">
+          <wp:anchor distT="0" distB="0" distL="114300" distR="114300" simplePos="0" relativeHeight="251658240" behindDoc="0" locked="0" layoutInCell="1" allowOverlap="1" ns4:anchorId="4B2A4C3C" ns4:editId="743085A4">
             <wp:simplePos x="0" y="0"/>
             <wp:positionH relativeFrom="column">
               <wp:posOffset>2295525</wp:posOffset>
@@ -37,11 +37,11 @@
             <wp:wrapNone/>
             <wp:docPr id="1833449723" name="Picture 1"/>
             <wp:cNvGraphicFramePr>
-              <a:graphicFrameLocks xmlns:a="http://schemas.openxmlformats.org/drawingml/2006/main" noChangeAspect="1"/>
+              <a:graphicFrameLocks noChangeAspect="1"/>
             </wp:cNvGraphicFramePr>
-            <a:graphic xmlns:a="http://schemas.openxmlformats.org/drawingml/2006/main">
+            <a:graphic>
               <a:graphicData uri="http://schemas.openxmlformats.org/drawingml/2006/picture">
-                <pic:pic xmlns:pic="http://schemas.openxmlformats.org/drawingml/2006/picture">
+                <pic:pic>
                   <pic:nvPicPr>
                     <pic:cNvPr id="1833449723" name="Picture 1833449723"/>
                     <pic:cNvPicPr/>
@@ -50,7 +50,7 @@
                     <a:blip r:embed="rId6" cstate="print">
                       <a:extLst>
                         <a:ext uri="{28A0092B-C50C-407E-A947-70E740481C1C}">
-                          <a14:useLocalDpi xmlns:a14="http://schemas.microsoft.com/office/drawing/2010/main" val="0"/>
+                          <ns8:useLocalDpi val="0"/>
                         </a:ext>
                       </a:extLst>
                     </a:blip>
@@ -70,17 +70,17 @@
                 </pic:pic>
               </a:graphicData>
             </a:graphic>
-            <wp14:sizeRelH relativeFrom="margin">
-              <wp14:pctWidth>0</wp14:pctWidth>
-            </wp14:sizeRelH>
-            <wp14:sizeRelV relativeFrom="margin">
-              <wp14:pctHeight>0</wp14:pctHeight>
-            </wp14:sizeRelV>
+            <ns4:sizeRelH relativeFrom="margin">
+              <ns4:pctWidth>0</ns4:pctWidth>
+            </ns4:sizeRelH>
+            <ns4:sizeRelV relativeFrom="margin">
+              <ns4:pctHeight>0</ns4:pctHeight>
+            </ns4:sizeRelV>
           </wp:anchor>
         </w:drawing>
       </w:r>
     </w:p>
-    <w:p>
+    <w:p ns2:paraId="168F5188" ns2:textId="77777777">
       <w:pPr>
         <w:pStyle w:val="Heading1"/>
         <w:ind w:right="520"/>
@@ -94,7 +94,7 @@
         </w:rPr>
       </w:pPr>
     </w:p>
-    <w:p>
+    <w:p ns2:paraId="6940974D" ns2:textId="0867F0D8">
       <w:pPr>
         <w:pStyle w:val="Heading1"/>
         <w:spacing w:before="0" w:after="0" w:line="240" w:lineRule="auto"/>
@@ -164,7 +164,7 @@
         <w:t>COLLEGE</w:t>
       </w:r>
     </w:p>
-    <w:p>
+    <w:p ns2:paraId="1118FEA3" ns2:textId="77777777">
       <w:pPr>
         <w:ind w:left="1440" w:right="470" w:firstLine="720"/>
         <w:rPr>
@@ -228,21 +228,21 @@
         <w:t>Institution)</w:t>
       </w:r>
     </w:p>
-    <w:p>
+    <w:p ns2:paraId="258D0C45" ns2:textId="77777777">
       <w:pPr>
         <w:rPr>
           <w:b/>
         </w:rPr>
       </w:pPr>
     </w:p>
-    <w:p>
+    <w:p ns2:paraId="689DB40F" ns2:textId="77777777">
       <w:pPr>
         <w:rPr>
           <w:b/>
         </w:rPr>
       </w:pPr>
     </w:p>
-    <w:p>
+    <w:p ns2:paraId="0CF75AED" ns2:textId="77777777">
       <w:pPr>
         <w:rPr>
           <w:b/>
@@ -251,7 +251,7 @@
         </w:rPr>
       </w:pPr>
     </w:p>
-    <w:p>
+    <w:p ns2:paraId="06443312" ns2:textId="77777777">
       <w:pPr>
         <w:rPr>
           <w:b/>
@@ -260,7 +260,7 @@
         </w:rPr>
       </w:pPr>
     </w:p>
-    <w:p>
+    <w:p ns2:paraId="443199E2" ns2:textId="77777777">
       <w:pPr>
         <w:spacing w:line="276" w:lineRule="auto"/>
         <w:jc w:val="center"/>
@@ -281,7 +281,7 @@
         <w:t xml:space="preserve">HACKATHON ACHIEVERS </w:t>
       </w:r>
     </w:p>
-    <w:p>
+    <w:p ns2:paraId="365F3513" ns2:textId="4C8A091C">
       <w:pPr>
         <w:spacing w:line="276" w:lineRule="auto"/>
         <w:jc w:val="center"/>
@@ -322,7 +322,7 @@
         <w:t xml:space="preserve"> DAY - 15.10.26</w:t>
       </w:r>
     </w:p>
-    <w:p>
+    <w:p ns2:paraId="765BB0E0" ns2:textId="77777777">
       <w:pPr>
         <w:spacing w:line="276" w:lineRule="auto"/>
         <w:jc w:val="center"/>
@@ -334,7 +334,7 @@
         </w:rPr>
       </w:pPr>
     </w:p>
-    <w:p>
+    <w:p ns2:paraId="0617574B" ns2:textId="77777777">
       <w:pPr>
         <w:spacing w:line="276" w:lineRule="auto"/>
         <w:jc w:val="center"/>
@@ -346,7 +346,7 @@
         </w:rPr>
       </w:pPr>
     </w:p>
-    <w:p>
+    <w:p ns2:paraId="487C8787" ns2:textId="77777777">
       <w:pPr>
         <w:spacing w:line="276" w:lineRule="auto"/>
         <w:jc w:val="center"/>
@@ -358,7 +358,7 @@
         </w:rPr>
       </w:pPr>
     </w:p>
-    <w:p>
+    <w:p ns2:paraId="6C68111E" ns2:textId="77777777">
       <w:pPr>
         <w:spacing w:line="276" w:lineRule="auto"/>
         <w:jc w:val="center"/>
@@ -370,7 +370,7 @@
         </w:rPr>
       </w:pPr>
     </w:p>
-    <w:p>
+    <w:p ns2:paraId="6F65AC3F" ns2:textId="77777777">
       <w:pPr>
         <w:spacing w:line="276" w:lineRule="auto"/>
         <w:jc w:val="center"/>
@@ -382,7 +382,7 @@
         </w:rPr>
       </w:pPr>
     </w:p>
-    <w:p>
+    <w:p ns2:paraId="456F18D3" ns2:textId="77777777">
       <w:pPr>
         <w:spacing w:line="276" w:lineRule="auto"/>
         <w:jc w:val="center"/>
@@ -403,7 +403,7 @@
         <w:t>ODD SEMESTER</w:t>
       </w:r>
     </w:p>
-    <w:p>
+    <w:p ns2:paraId="52183789" ns2:textId="77777777">
       <w:pPr>
         <w:spacing w:line="276" w:lineRule="auto"/>
         <w:jc w:val="center"/>
@@ -424,7 +424,7 @@
         <w:t>2026-2027</w:t>
       </w:r>
     </w:p>
-    <w:p>
+    <w:p ns2:paraId="510E38B4" ns2:textId="77777777">
       <w:pPr>
         <w:jc w:val="center"/>
         <w:rPr>
@@ -435,7 +435,7 @@
         </w:rPr>
       </w:pPr>
     </w:p>
-    <w:p>
+    <w:p ns2:paraId="50C2812D" ns2:textId="77777777">
       <w:pPr>
         <w:jc w:val="center"/>
         <w:rPr>
@@ -444,7 +444,7 @@
         </w:rPr>
       </w:pPr>
     </w:p>
-    <w:p>
+    <w:p ns2:paraId="79480827" ns2:textId="77777777">
       <w:pPr>
         <w:jc w:val="center"/>
         <w:rPr>
@@ -453,7 +453,7 @@
         </w:rPr>
       </w:pPr>
     </w:p>
-    <w:p>
+    <w:p ns2:paraId="1C1812A8" ns2:textId="77777777">
       <w:pPr>
         <w:jc w:val="center"/>
         <w:rPr>
@@ -462,7 +462,7 @@
         </w:rPr>
       </w:pPr>
     </w:p>
-    <w:p>
+    <w:p ns2:paraId="5E0CF873" ns2:textId="77777777">
       <w:pPr>
         <w:jc w:val="center"/>
         <w:rPr>
@@ -471,7 +471,7 @@
         </w:rPr>
       </w:pPr>
     </w:p>
-    <w:p>
+    <w:p ns2:paraId="63DAC581" ns2:textId="77777777">
       <w:pPr>
         <w:jc w:val="center"/>
         <w:rPr>
@@ -480,7 +480,7 @@
         </w:rPr>
       </w:pPr>
     </w:p>
-    <w:p>
+    <w:p ns2:paraId="21CE0EF8" ns2:textId="77777777">
       <w:pPr>
         <w:jc w:val="center"/>
         <w:rPr>
@@ -489,7 +489,7 @@
         </w:rPr>
       </w:pPr>
     </w:p>
-    <w:p>
+    <w:p ns2:paraId="125999F3" ns2:textId="77777777">
       <w:pPr>
         <w:jc w:val="center"/>
         <w:rPr>
@@ -498,7 +498,7 @@
         </w:rPr>
       </w:pPr>
     </w:p>
-    <w:p>
+    <w:p ns2:paraId="046E68B3" ns2:textId="77777777">
       <w:pPr>
         <w:jc w:val="center"/>
         <w:rPr>
@@ -507,7 +507,7 @@
         </w:rPr>
       </w:pPr>
     </w:p>
-    <w:p>
+    <w:p ns2:paraId="44B9C0E8" ns2:textId="77777777">
       <w:pPr>
         <w:spacing w:line="276" w:lineRule="auto"/>
         <w:jc w:val="center"/>
@@ -528,7 +528,7 @@
         <w:t xml:space="preserve">HACKATHON ACHIEVERS </w:t>
       </w:r>
     </w:p>
-    <w:p>
+    <w:p ns2:paraId="3F767564" ns2:textId="1FB40DE5">
       <w:pPr>
         <w:jc w:val="center"/>
         <w:rPr>
@@ -568,7 +568,7 @@
         <w:t xml:space="preserve"> DAY - 15.10.26</w:t>
       </w:r>
     </w:p>
-    <w:p>
+    <w:p ns2:paraId="3E824DBA" ns2:textId="77777777">
       <w:pPr>
         <w:jc w:val="center"/>
         <w:rPr>
@@ -581,7 +581,7 @@
       <w:bookmarkStart w:id="0" w:name="_GoBack"/>
       <w:bookmarkEnd w:id="0"/>
     </w:p>
-    <w:p>
+    <w:p ns2:paraId="3D401A20" ns2:textId="328F70EA">
       <w:pPr>
         <w:jc w:val="center"/>
         <w:rPr>
@@ -630,7 +630,7 @@
         <w:t>-2027</w:t>
       </w:r>
     </w:p>
-    <w:p>
+    <w:p ns2:paraId="43EB83EB" ns2:textId="77777777">
       <w:pPr>
         <w:jc w:val="center"/>
         <w:rPr>
@@ -641,7 +641,7 @@
         </w:rPr>
       </w:pPr>
     </w:p>
-    <w:p>
+    <w:p ns2:paraId="5DF6B423" ns2:textId="77777777">
       <w:pPr>
         <w:jc w:val="center"/>
         <w:rPr>
@@ -667,12 +667,12 @@
         <w:gridCol w:w="1305"/>
         <w:gridCol w:w="1292"/>
       </w:tblGrid>
-      <w:tr>
+      <w:tr ns2:paraId="38C27DAA" ns2:textId="77777777">
         <w:tc>
           <w:tcPr>
             <w:tcW w:w="851" w:type="dxa"/>
           </w:tcPr>
-          <w:p>
+          <w:p ns2:paraId="03F8F820" ns2:textId="1663EBCB">
             <w:pPr>
               <w:jc w:val="center"/>
               <w:rPr>
@@ -699,7 +699,7 @@
           <w:tcPr>
             <w:tcW w:w="2153" w:type="dxa"/>
           </w:tcPr>
-          <w:p>
+          <w:p ns2:paraId="0153947B" ns2:textId="6E7F1D27">
             <w:pPr>
               <w:jc w:val="center"/>
               <w:rPr>
@@ -724,7 +724,7 @@
           <w:tcPr>
             <w:tcW w:w="1576" w:type="dxa"/>
           </w:tcPr>
-          <w:p>
+          <w:p ns2:paraId="7E73F6A4" ns2:textId="315D499B">
             <w:pPr>
               <w:jc w:val="center"/>
               <w:rPr>
@@ -749,7 +749,7 @@
           <w:tcPr>
             <w:tcW w:w="2083" w:type="dxa"/>
           </w:tcPr>
-          <w:p>
+          <w:p ns2:paraId="41C9E81E" ns2:textId="6D69639A">
             <w:pPr>
               <w:jc w:val="center"/>
               <w:rPr>
@@ -774,7 +774,7 @@
           <w:tcPr>
             <w:tcW w:w="994" w:type="dxa"/>
           </w:tcPr>
-          <w:p>
+          <w:p ns2:paraId="79DA938C" ns2:textId="2C9E0089">
             <w:pPr>
               <w:jc w:val="center"/>
               <w:rPr>
@@ -799,7 +799,7 @@
           <w:tcPr>
             <w:tcW w:w="1305" w:type="dxa"/>
           </w:tcPr>
-          <w:p>
+          <w:p ns2:paraId="22FEB9CB" ns2:textId="6AE1C1CC">
             <w:pPr>
               <w:jc w:val="center"/>
               <w:rPr>
@@ -824,7 +824,7 @@
           <w:tcPr>
             <w:tcW w:w="1292" w:type="dxa"/>
           </w:tcPr>
-          <w:p>
+          <w:p ns2:paraId="515B5B18" ns2:textId="36E8382F">
             <w:pPr>
               <w:jc w:val="center"/>
               <w:rPr>
@@ -846,13 +846,13 @@
           </w:p>
         </w:tc>
       </w:tr>
-      <w:tr>
+      <w:tr ns2:paraId="7730CF22" ns2:textId="77777777">
         <w:tc>
           <w:tcPr>
             <w:tcW w:w="851" w:type="dxa"/>
             <w:vMerge w:val="restart"/>
           </w:tcPr>
-          <w:p>
+          <w:p ns2:paraId="185BA359" ns2:textId="6023ADA3">
             <w:pPr>
               <w:spacing w:before="240"/>
               <w:jc w:val="center"/>
@@ -874,7 +874,7 @@
           <w:tcPr>
             <w:tcW w:w="2153" w:type="dxa"/>
           </w:tcPr>
-          <w:p>
+          <w:p ns2:paraId="0E9656D7" ns2:textId="02E10E74">
             <w:pPr>
               <w:spacing w:before="240"/>
               <w:jc w:val="center"/>
@@ -896,7 +896,7 @@
           <w:tcPr>
             <w:tcW w:w="1576" w:type="dxa"/>
           </w:tcPr>
-          <w:p>
+          <w:p ns2:paraId="388E30DA" ns2:textId="1F32BE27">
             <w:pPr>
               <w:spacing w:before="240"/>
               <w:jc w:val="center"/>
@@ -919,7 +919,7 @@
             <w:tcW w:w="2083" w:type="dxa"/>
             <w:vMerge w:val="restart"/>
           </w:tcPr>
-          <w:p>
+          <w:p ns2:paraId="610C839B" ns2:textId="77777777">
             <w:pPr>
               <w:spacing w:before="240"/>
               <w:jc w:val="center"/>
@@ -936,7 +936,7 @@
               <w:t>BHARAT SHAKTHI TRACK</w:t>
             </w:r>
           </w:p>
-          <w:p>
+          <w:p ns2:paraId="41F4DE42" ns2:textId="65A9BB23">
             <w:pPr>
               <w:spacing w:before="240"/>
               <w:jc w:val="center"/>
@@ -959,7 +959,7 @@
             <w:tcW w:w="994" w:type="dxa"/>
             <w:vMerge w:val="restart"/>
           </w:tcPr>
-          <w:p>
+          <w:p ns2:paraId="61D92CDE" ns2:textId="77777777">
             <w:pPr>
               <w:spacing w:before="240"/>
               <w:jc w:val="center"/>
@@ -976,7 +976,7 @@
               <w:t>01 AUG</w:t>
             </w:r>
           </w:p>
-          <w:p>
+          <w:p ns2:paraId="62D24607" ns2:textId="77777777">
             <w:pPr>
               <w:spacing w:before="240"/>
               <w:jc w:val="center"/>
@@ -993,17 +993,17 @@
               <w:t>2026</w:t>
             </w:r>
           </w:p>
-          <w:p>
-            <w:pPr>
-              <w:spacing w:before="240"/>
-              <w:jc w:val="center"/>
-              <w:rPr>
-                <w:sz w:val="24"/>
-                <w:szCs w:val="24"/>
-              </w:rPr>
-            </w:pPr>
-          </w:p>
-          <w:p>
+          <w:p ns2:paraId="0E86001B" ns2:textId="77777777">
+            <w:pPr>
+              <w:spacing w:before="240"/>
+              <w:jc w:val="center"/>
+              <w:rPr>
+                <w:sz w:val="24"/>
+                <w:szCs w:val="24"/>
+              </w:rPr>
+            </w:pPr>
+          </w:p>
+          <w:p ns2:paraId="69FF5341" ns2:textId="0CA01D93">
             <w:pPr>
               <w:spacing w:before="240"/>
               <w:jc w:val="center"/>
@@ -1019,7 +1019,7 @@
             <w:tcW w:w="1305" w:type="dxa"/>
             <w:vMerge w:val="restart"/>
           </w:tcPr>
-          <w:p>
+          <w:p ns2:paraId="710D5372" ns2:textId="761A9F6F">
             <w:pPr>
               <w:spacing w:before="240"/>
               <w:jc w:val="center"/>
@@ -1046,7 +1046,7 @@
             <w:tcW w:w="1292" w:type="dxa"/>
             <w:vMerge w:val="restart"/>
           </w:tcPr>
-          <w:p>
+          <w:p ns2:paraId="0329D72F" ns2:textId="63C9E183">
             <w:pPr>
               <w:spacing w:before="240"/>
               <w:jc w:val="center"/>
@@ -1069,13 +1069,13 @@
           </w:p>
         </w:tc>
       </w:tr>
-      <w:tr>
+      <w:tr ns2:paraId="0EFD2AB4" ns2:textId="77777777">
         <w:tc>
           <w:tcPr>
             <w:tcW w:w="851" w:type="dxa"/>
             <w:vMerge/>
           </w:tcPr>
-          <w:p>
+          <w:p ns2:paraId="268739E0" ns2:textId="77777777">
             <w:pPr>
               <w:spacing w:before="240"/>
               <w:jc w:val="center"/>
@@ -1090,7 +1090,7 @@
           <w:tcPr>
             <w:tcW w:w="2153" w:type="dxa"/>
           </w:tcPr>
-          <w:p>
+          <w:p ns2:paraId="2CC40DC8" ns2:textId="40C68D67">
             <w:pPr>
               <w:spacing w:before="240"/>
               <w:jc w:val="center"/>
@@ -1112,7 +1112,7 @@
           <w:tcPr>
             <w:tcW w:w="1576" w:type="dxa"/>
           </w:tcPr>
-          <w:p>
+          <w:p ns2:paraId="78518F77" ns2:textId="2A907D74">
             <w:pPr>
               <w:spacing w:before="240"/>
               <w:jc w:val="center"/>
@@ -1135,7 +1135,7 @@
             <w:tcW w:w="2083" w:type="dxa"/>
             <w:vMerge/>
           </w:tcPr>
-          <w:p>
+          <w:p ns2:paraId="6BF9B1F4" ns2:textId="77777777">
             <w:pPr>
               <w:spacing w:before="240"/>
               <w:jc w:val="center"/>
@@ -1151,7 +1151,7 @@
             <w:tcW w:w="994" w:type="dxa"/>
             <w:vMerge/>
           </w:tcPr>
-          <w:p>
+          <w:p ns2:paraId="652CC2DE" ns2:textId="77777777">
             <w:pPr>
               <w:spacing w:before="240"/>
               <w:jc w:val="center"/>
@@ -1167,7 +1167,7 @@
             <w:tcW w:w="1305" w:type="dxa"/>
             <w:vMerge/>
           </w:tcPr>
-          <w:p>
+          <w:p ns2:paraId="6E97BD10" ns2:textId="77777777">
             <w:pPr>
               <w:spacing w:before="240"/>
               <w:jc w:val="center"/>
@@ -1183,7 +1183,7 @@
             <w:tcW w:w="1292" w:type="dxa"/>
             <w:vMerge/>
           </w:tcPr>
-          <w:p>
+          <w:p ns2:paraId="013CA7C7" ns2:textId="27471FB2">
             <w:pPr>
               <w:spacing w:before="240"/>
               <w:jc w:val="center"/>
@@ -1195,13 +1195,13 @@
           </w:p>
         </w:tc>
       </w:tr>
-      <w:tr>
+      <w:tr ns2:paraId="1143880A" ns2:textId="77777777">
         <w:tc>
           <w:tcPr>
             <w:tcW w:w="851" w:type="dxa"/>
             <w:vMerge/>
           </w:tcPr>
-          <w:p>
+          <w:p ns2:paraId="215BF1B8" ns2:textId="77777777">
             <w:pPr>
               <w:spacing w:before="240"/>
               <w:jc w:val="center"/>
@@ -1216,7 +1216,7 @@
           <w:tcPr>
             <w:tcW w:w="2153" w:type="dxa"/>
           </w:tcPr>
-          <w:p>
+          <w:p ns2:paraId="5F54D2E8" ns2:textId="05FB71E7">
             <w:pPr>
               <w:spacing w:before="240"/>
               <w:jc w:val="center"/>
@@ -1238,7 +1238,7 @@
           <w:tcPr>
             <w:tcW w:w="1576" w:type="dxa"/>
           </w:tcPr>
-          <w:p>
+          <w:p ns2:paraId="542BF32C" ns2:textId="1C857703">
             <w:pPr>
               <w:spacing w:before="240"/>
               <w:jc w:val="center"/>
@@ -1261,7 +1261,7 @@
             <w:tcW w:w="2083" w:type="dxa"/>
             <w:vMerge/>
           </w:tcPr>
-          <w:p>
+          <w:p ns2:paraId="351CBBE5" ns2:textId="77777777">
             <w:pPr>
               <w:spacing w:before="240"/>
               <w:jc w:val="center"/>
@@ -1277,7 +1277,7 @@
             <w:tcW w:w="994" w:type="dxa"/>
             <w:vMerge/>
           </w:tcPr>
-          <w:p>
+          <w:p ns2:paraId="2A612306" ns2:textId="77777777">
             <w:pPr>
               <w:spacing w:before="240"/>
               <w:jc w:val="center"/>
@@ -1293,7 +1293,7 @@
             <w:tcW w:w="1305" w:type="dxa"/>
             <w:vMerge/>
           </w:tcPr>
-          <w:p>
+          <w:p ns2:paraId="155C5650" ns2:textId="77777777">
             <w:pPr>
               <w:spacing w:before="240"/>
               <w:jc w:val="center"/>
@@ -1309,7 +1309,7 @@
             <w:tcW w:w="1292" w:type="dxa"/>
             <w:vMerge/>
           </w:tcPr>
-          <w:p>
+          <w:p ns2:paraId="6B89670F" ns2:textId="4E3D0101">
             <w:pPr>
               <w:spacing w:before="240"/>
               <w:jc w:val="center"/>
@@ -1321,13 +1321,13 @@
           </w:p>
         </w:tc>
       </w:tr>
-      <w:tr>
+      <w:tr ns2:paraId="42D17C10" ns2:textId="77777777">
         <w:tc>
           <w:tcPr>
             <w:tcW w:w="851" w:type="dxa"/>
             <w:vMerge/>
           </w:tcPr>
-          <w:p>
+          <w:p ns2:paraId="66C69629" ns2:textId="77777777">
             <w:pPr>
               <w:spacing w:before="240"/>
               <w:jc w:val="center"/>
@@ -1342,7 +1342,7 @@
           <w:tcPr>
             <w:tcW w:w="2153" w:type="dxa"/>
           </w:tcPr>
-          <w:p>
+          <w:p ns2:paraId="6B7B9B60" ns2:textId="35152584">
             <w:pPr>
               <w:spacing w:before="240"/>
               <w:jc w:val="center"/>
@@ -1364,7 +1364,7 @@
           <w:tcPr>
             <w:tcW w:w="1576" w:type="dxa"/>
           </w:tcPr>
-          <w:p>
+          <w:p ns2:paraId="0004B514" ns2:textId="67CB2AD8">
             <w:pPr>
               <w:spacing w:before="240"/>
               <w:jc w:val="center"/>
@@ -1387,7 +1387,7 @@
             <w:tcW w:w="2083" w:type="dxa"/>
             <w:vMerge/>
           </w:tcPr>
-          <w:p>
+          <w:p ns2:paraId="4FA375D7" ns2:textId="77777777">
             <w:pPr>
               <w:spacing w:before="240"/>
               <w:jc w:val="center"/>
@@ -1403,7 +1403,7 @@
             <w:tcW w:w="994" w:type="dxa"/>
             <w:vMerge/>
           </w:tcPr>
-          <w:p>
+          <w:p ns2:paraId="4CEC8E13" ns2:textId="77777777">
             <w:pPr>
               <w:spacing w:before="240"/>
               <w:jc w:val="center"/>
@@ -1419,7 +1419,7 @@
             <w:tcW w:w="1305" w:type="dxa"/>
             <w:vMerge/>
           </w:tcPr>
-          <w:p>
+          <w:p ns2:paraId="38A710C3" ns2:textId="77777777">
             <w:pPr>
               <w:spacing w:before="240"/>
               <w:jc w:val="center"/>
@@ -1435,7 +1435,7 @@
             <w:tcW w:w="1292" w:type="dxa"/>
             <w:vMerge/>
           </w:tcPr>
-          <w:p>
+          <w:p ns2:paraId="2A1355DB" ns2:textId="1267F177">
             <w:pPr>
               <w:spacing w:before="240"/>
               <w:jc w:val="center"/>
@@ -1447,13 +1447,13 @@
           </w:p>
         </w:tc>
       </w:tr>
-      <w:tr>
+      <w:tr ns2:paraId="23BBC1E8" ns2:textId="77777777">
         <w:tc>
           <w:tcPr>
             <w:tcW w:w="851" w:type="dxa"/>
             <w:vMerge/>
           </w:tcPr>
-          <w:p>
+          <w:p ns2:paraId="799152EB" ns2:textId="77777777">
             <w:pPr>
               <w:spacing w:before="240"/>
               <w:jc w:val="center"/>
@@ -1468,7 +1468,7 @@
           <w:tcPr>
             <w:tcW w:w="2153" w:type="dxa"/>
           </w:tcPr>
-          <w:p>
+          <w:p ns2:paraId="5726EACB" ns2:textId="7FA14E43">
             <w:pPr>
               <w:spacing w:before="240"/>
               <w:jc w:val="center"/>
@@ -1490,7 +1490,7 @@
           <w:tcPr>
             <w:tcW w:w="1576" w:type="dxa"/>
           </w:tcPr>
-          <w:p>
+          <w:p ns2:paraId="0B0A5D78" ns2:textId="6F36E8D2">
             <w:pPr>
               <w:spacing w:before="240"/>
               <w:jc w:val="center"/>
@@ -1513,7 +1513,7 @@
             <w:tcW w:w="2083" w:type="dxa"/>
             <w:vMerge/>
           </w:tcPr>
-          <w:p>
+          <w:p ns2:paraId="27B07167" ns2:textId="77777777">
             <w:pPr>
               <w:spacing w:before="240"/>
               <w:jc w:val="center"/>
@@ -1529,7 +1529,7 @@
             <w:tcW w:w="994" w:type="dxa"/>
             <w:vMerge/>
           </w:tcPr>
-          <w:p>
+          <w:p ns2:paraId="36FB47B9" ns2:textId="77777777">
             <w:pPr>
               <w:spacing w:before="240"/>
               <w:jc w:val="center"/>
@@ -1545,7 +1545,7 @@
             <w:tcW w:w="1305" w:type="dxa"/>
             <w:vMerge/>
           </w:tcPr>
-          <w:p>
+          <w:p ns2:paraId="78EEEC33" ns2:textId="77777777">
             <w:pPr>
               <w:spacing w:before="240"/>
               <w:jc w:val="center"/>
@@ -1561,7 +1561,7 @@
             <w:tcW w:w="1292" w:type="dxa"/>
             <w:vMerge/>
           </w:tcPr>
-          <w:p>
+          <w:p ns2:paraId="60FB4CBC" ns2:textId="7C3ADAF5">
             <w:pPr>
               <w:spacing w:before="240"/>
               <w:jc w:val="center"/>
@@ -1573,13 +1573,13 @@
           </w:p>
         </w:tc>
       </w:tr>
-      <w:tr>
+      <w:tr ns2:paraId="492DD230" ns2:textId="77777777">
         <w:tc>
           <w:tcPr>
             <w:tcW w:w="851" w:type="dxa"/>
             <w:vMerge w:val="restart"/>
           </w:tcPr>
-          <w:p>
+          <w:p ns2:paraId="1297ADF6" ns2:textId="73A73AFA">
             <w:pPr>
               <w:spacing w:before="240"/>
               <w:jc w:val="center"/>
@@ -1601,7 +1601,7 @@
           <w:tcPr>
             <w:tcW w:w="2153" w:type="dxa"/>
           </w:tcPr>
-          <w:p>
+          <w:p ns2:paraId="5FF96412" ns2:textId="6956BC3F">
             <w:pPr>
               <w:spacing w:before="240"/>
               <w:jc w:val="center"/>
@@ -1623,7 +1623,7 @@
           <w:tcPr>
             <w:tcW w:w="1576" w:type="dxa"/>
           </w:tcPr>
-          <w:p>
+          <w:p ns2:paraId="7D80FF18" ns2:textId="4FF3B79F">
             <w:pPr>
               <w:spacing w:before="240"/>
               <w:jc w:val="center"/>
@@ -1646,7 +1646,7 @@
             <w:tcW w:w="2083" w:type="dxa"/>
             <w:vMerge w:val="restart"/>
           </w:tcPr>
-          <w:p>
+          <w:p ns2:paraId="58C745E3" ns2:textId="082FDD50">
             <w:pPr>
               <w:spacing w:before="240"/>
               <w:jc w:val="center"/>
@@ -1669,7 +1669,7 @@
             <w:tcW w:w="994" w:type="dxa"/>
             <w:vMerge w:val="restart"/>
           </w:tcPr>
-          <w:p>
+          <w:p ns2:paraId="1553D902" ns2:textId="020526D9">
             <w:pPr>
               <w:spacing w:before="240"/>
               <w:jc w:val="center"/>
@@ -1686,7 +1686,7 @@
               <w:t>13    SEP</w:t>
             </w:r>
           </w:p>
-          <w:p>
+          <w:p ns2:paraId="4137AC1B" ns2:textId="77777777">
             <w:pPr>
               <w:spacing w:before="240"/>
               <w:jc w:val="center"/>
@@ -1703,7 +1703,7 @@
               <w:t>2026</w:t>
             </w:r>
           </w:p>
-          <w:p>
+          <w:p ns2:paraId="6FD0ED34" ns2:textId="37696ADF">
             <w:pPr>
               <w:spacing w:before="240"/>
               <w:jc w:val="center"/>
@@ -1719,7 +1719,7 @@
             <w:tcW w:w="1305" w:type="dxa"/>
             <w:vMerge w:val="restart"/>
           </w:tcPr>
-          <w:p>
+          <w:p ns2:paraId="3D28D8A1" ns2:textId="1790CBA9">
             <w:pPr>
               <w:spacing w:before="240"/>
               <w:jc w:val="center"/>
@@ -1746,7 +1746,7 @@
             <w:tcW w:w="1292" w:type="dxa"/>
             <w:vMerge w:val="restart"/>
           </w:tcPr>
-          <w:p>
+          <w:p ns2:paraId="630B7253" ns2:textId="449589C4">
             <w:pPr>
               <w:spacing w:before="240"/>
               <w:jc w:val="center"/>
@@ -1769,13 +1769,13 @@
           </w:p>
         </w:tc>
       </w:tr>
-      <w:tr>
+      <w:tr ns2:paraId="3A741B22" ns2:textId="77777777">
         <w:tc>
           <w:tcPr>
             <w:tcW w:w="851" w:type="dxa"/>
             <w:vMerge/>
           </w:tcPr>
-          <w:p>
+          <w:p ns2:paraId="3BE2500B" ns2:textId="77777777">
             <w:pPr>
               <w:spacing w:before="240"/>
               <w:jc w:val="center"/>
@@ -1790,7 +1790,7 @@
           <w:tcPr>
             <w:tcW w:w="2153" w:type="dxa"/>
           </w:tcPr>
-          <w:p>
+          <w:p ns2:paraId="742589B0" ns2:textId="1004321E">
             <w:pPr>
               <w:spacing w:before="240"/>
               <w:jc w:val="center"/>
@@ -1812,7 +1812,7 @@
           <w:tcPr>
             <w:tcW w:w="1576" w:type="dxa"/>
           </w:tcPr>
-          <w:p>
+          <w:p ns2:paraId="5F202104" ns2:textId="1B30542D">
             <w:pPr>
               <w:spacing w:before="240"/>
               <w:jc w:val="center"/>
@@ -1835,7 +1835,7 @@
             <w:tcW w:w="2083" w:type="dxa"/>
             <w:vMerge/>
           </w:tcPr>
-          <w:p>
+          <w:p ns2:paraId="6E9F8EDC" ns2:textId="77777777">
             <w:pPr>
               <w:spacing w:before="240"/>
               <w:jc w:val="center"/>
@@ -1851,7 +1851,7 @@
             <w:tcW w:w="994" w:type="dxa"/>
             <w:vMerge/>
           </w:tcPr>
-          <w:p>
+          <w:p ns2:paraId="7A388A26" ns2:textId="77777777">
             <w:pPr>
               <w:spacing w:before="240"/>
               <w:jc w:val="center"/>
@@ -1867,7 +1867,7 @@
             <w:tcW w:w="1305" w:type="dxa"/>
             <w:vMerge/>
           </w:tcPr>
-          <w:p>
+          <w:p ns2:paraId="6618DA4D" ns2:textId="77777777">
             <w:pPr>
               <w:spacing w:before="240"/>
               <w:jc w:val="center"/>
@@ -1883,7 +1883,7 @@
             <w:tcW w:w="1292" w:type="dxa"/>
             <w:vMerge/>
           </w:tcPr>
-          <w:p>
+          <w:p ns2:paraId="627B979C" ns2:textId="77777777">
             <w:pPr>
               <w:spacing w:before="240"/>
               <w:jc w:val="center"/>
@@ -1895,13 +1895,13 @@
           </w:p>
         </w:tc>
       </w:tr>
-      <w:tr>
+      <w:tr ns2:paraId="49E5C1D0" ns2:textId="77777777">
         <w:tc>
           <w:tcPr>
             <w:tcW w:w="851" w:type="dxa"/>
             <w:vMerge/>
           </w:tcPr>
-          <w:p>
+          <w:p ns2:paraId="452AA94B" ns2:textId="77777777">
             <w:pPr>
               <w:spacing w:before="240"/>
               <w:jc w:val="center"/>
@@ -1916,7 +1916,7 @@
           <w:tcPr>
             <w:tcW w:w="2153" w:type="dxa"/>
           </w:tcPr>
-          <w:p>
+          <w:p ns2:paraId="10AD6A68" ns2:textId="354F63FA">
             <w:pPr>
               <w:spacing w:before="240"/>
               <w:jc w:val="center"/>
@@ -1938,7 +1938,7 @@
           <w:tcPr>
             <w:tcW w:w="1576" w:type="dxa"/>
           </w:tcPr>
-          <w:p>
+          <w:p ns2:paraId="67D7C82F" ns2:textId="5886ABAD">
             <w:pPr>
               <w:spacing w:before="240"/>
               <w:jc w:val="center"/>
@@ -1961,7 +1961,7 @@
             <w:tcW w:w="2083" w:type="dxa"/>
             <w:vMerge/>
           </w:tcPr>
-          <w:p>
+          <w:p ns2:paraId="5C2799F3" ns2:textId="77777777">
             <w:pPr>
               <w:spacing w:before="240"/>
               <w:jc w:val="center"/>
@@ -1977,7 +1977,7 @@
             <w:tcW w:w="994" w:type="dxa"/>
             <w:vMerge/>
           </w:tcPr>
-          <w:p>
+          <w:p ns2:paraId="7649E82D" ns2:textId="77777777">
             <w:pPr>
               <w:spacing w:before="240"/>
               <w:jc w:val="center"/>
@@ -1993,7 +1993,7 @@
             <w:tcW w:w="1305" w:type="dxa"/>
             <w:vMerge/>
           </w:tcPr>
-          <w:p>
+          <w:p ns2:paraId="0C5CEB94" ns2:textId="77777777">
             <w:pPr>
               <w:spacing w:before="240"/>
               <w:jc w:val="center"/>
@@ -2009,7 +2009,7 @@
             <w:tcW w:w="1292" w:type="dxa"/>
             <w:vMerge/>
           </w:tcPr>
-          <w:p>
+          <w:p ns2:paraId="63C64F86" ns2:textId="77777777">
             <w:pPr>
               <w:spacing w:before="240"/>
               <w:jc w:val="center"/>
@@ -2021,13 +2021,13 @@
           </w:p>
         </w:tc>
       </w:tr>
-      <w:tr>
+      <w:tr ns2:paraId="584181A8" ns2:textId="77777777">
         <w:tc>
           <w:tcPr>
             <w:tcW w:w="851" w:type="dxa"/>
             <w:vMerge/>
           </w:tcPr>
-          <w:p>
+          <w:p ns2:paraId="5CA7DDD2" ns2:textId="77777777">
             <w:pPr>
               <w:spacing w:before="240"/>
               <w:jc w:val="center"/>
@@ -2042,7 +2042,7 @@
           <w:tcPr>
             <w:tcW w:w="2153" w:type="dxa"/>
           </w:tcPr>
-          <w:p>
+          <w:p ns2:paraId="2EF5BBB9" ns2:textId="716FEEB3">
             <w:pPr>
               <w:spacing w:before="240"/>
               <w:jc w:val="center"/>
@@ -2064,7 +2064,7 @@
           <w:tcPr>
             <w:tcW w:w="1576" w:type="dxa"/>
           </w:tcPr>
-          <w:p>
+          <w:p ns2:paraId="242F7A68" ns2:textId="7174B248">
             <w:pPr>
               <w:spacing w:before="240"/>
               <w:jc w:val="center"/>
@@ -2087,7 +2087,7 @@
             <w:tcW w:w="2083" w:type="dxa"/>
             <w:vMerge/>
           </w:tcPr>
-          <w:p>
+          <w:p ns2:paraId="4C77A539" ns2:textId="77777777">
             <w:pPr>
               <w:spacing w:before="240"/>
               <w:jc w:val="center"/>
@@ -2103,7 +2103,7 @@
             <w:tcW w:w="994" w:type="dxa"/>
             <w:vMerge/>
           </w:tcPr>
-          <w:p>
+          <w:p ns2:paraId="250A5373" ns2:textId="77777777">
             <w:pPr>
               <w:spacing w:before="240"/>
               <w:jc w:val="center"/>
@@ -2119,7 +2119,7 @@
             <w:tcW w:w="1305" w:type="dxa"/>
             <w:vMerge/>
           </w:tcPr>
-          <w:p>
+          <w:p ns2:paraId="18303128" ns2:textId="77777777">
             <w:pPr>
               <w:spacing w:before="240"/>
               <w:jc w:val="center"/>
@@ -2135,7 +2135,7 @@
             <w:tcW w:w="1292" w:type="dxa"/>
             <w:vMerge/>
           </w:tcPr>
-          <w:p>
+          <w:p ns2:paraId="0BDA7EDC" ns2:textId="77777777">
             <w:pPr>
               <w:spacing w:before="240"/>
               <w:jc w:val="center"/>
@@ -2147,13 +2147,13 @@
           </w:p>
         </w:tc>
       </w:tr>
-      <w:tr>
+      <w:tr ns2:paraId="508D4C8E" ns2:textId="77777777">
         <w:tc>
           <w:tcPr>
             <w:tcW w:w="851" w:type="dxa"/>
             <w:vMerge/>
           </w:tcPr>
-          <w:p>
+          <w:p ns2:paraId="141BAF85" ns2:textId="77777777">
             <w:pPr>
               <w:spacing w:before="240"/>
               <w:jc w:val="center"/>
@@ -2168,7 +2168,7 @@
           <w:tcPr>
             <w:tcW w:w="2153" w:type="dxa"/>
           </w:tcPr>
-          <w:p>
+          <w:p ns2:paraId="05294A60" ns2:textId="7BAD7F80">
             <w:pPr>
               <w:spacing w:before="240"/>
               <w:jc w:val="center"/>
@@ -2190,7 +2190,7 @@
           <w:tcPr>
             <w:tcW w:w="1576" w:type="dxa"/>
           </w:tcPr>
-          <w:p>
+          <w:p ns2:paraId="1C16FC2D" ns2:textId="77777777">
             <w:pPr>
               <w:spacing w:before="240"/>
               <w:jc w:val="center"/>
@@ -2206,7 +2206,7 @@
             <w:tcW w:w="2083" w:type="dxa"/>
             <w:vMerge/>
           </w:tcPr>
-          <w:p>
+          <w:p ns2:paraId="38D4FFC6" ns2:textId="77777777">
             <w:pPr>
               <w:spacing w:before="240"/>
               <w:jc w:val="center"/>
@@ -2222,7 +2222,7 @@
             <w:tcW w:w="994" w:type="dxa"/>
             <w:vMerge/>
           </w:tcPr>
-          <w:p>
+          <w:p ns2:paraId="5E6515F6" ns2:textId="77777777">
             <w:pPr>
               <w:spacing w:before="240"/>
               <w:jc w:val="center"/>
@@ -2238,7 +2238,7 @@
             <w:tcW w:w="1305" w:type="dxa"/>
             <w:vMerge/>
           </w:tcPr>
-          <w:p>
+          <w:p ns2:paraId="67085FB2" ns2:textId="77777777">
             <w:pPr>
               <w:spacing w:before="240"/>
               <w:jc w:val="center"/>
@@ -2254,7 +2254,7 @@
             <w:tcW w:w="1292" w:type="dxa"/>
             <w:vMerge/>
           </w:tcPr>
-          <w:p>
+          <w:p ns2:paraId="474C2DFE" ns2:textId="77777777">
             <w:pPr>
               <w:spacing w:before="240"/>
               <w:jc w:val="center"/>
@@ -2266,13 +2266,13 @@
           </w:p>
         </w:tc>
       </w:tr>
-      <w:tr>
+      <w:tr ns2:paraId="17492C11" ns2:textId="77777777">
         <w:tc>
           <w:tcPr>
             <w:tcW w:w="851" w:type="dxa"/>
             <w:vMerge w:val="restart"/>
           </w:tcPr>
-          <w:p>
+          <w:p ns2:paraId="1D508C31" ns2:textId="296B480E">
             <w:pPr>
               <w:spacing w:before="240"/>
               <w:jc w:val="center"/>
@@ -2294,7 +2294,7 @@
           <w:tcPr>
             <w:tcW w:w="2153" w:type="dxa"/>
           </w:tcPr>
-          <w:p>
+          <w:p ns2:paraId="361EF5BD" ns2:textId="6F852426">
             <w:pPr>
               <w:spacing w:before="240"/>
               <w:jc w:val="center"/>
@@ -2316,7 +2316,7 @@
           <w:tcPr>
             <w:tcW w:w="1576" w:type="dxa"/>
           </w:tcPr>
-          <w:p>
+          <w:p ns2:paraId="5CC62781" ns2:textId="219904B8">
             <w:pPr>
               <w:spacing w:before="240"/>
               <w:jc w:val="center"/>
@@ -2339,7 +2339,7 @@
             <w:tcW w:w="2083" w:type="dxa"/>
             <w:vMerge w:val="restart"/>
           </w:tcPr>
-          <w:p>
+          <w:p ns2:paraId="38E66385" ns2:textId="6B0C3497">
             <w:pPr>
               <w:spacing w:before="240"/>
               <w:jc w:val="center"/>
@@ -2362,7 +2362,7 @@
             <w:tcW w:w="994" w:type="dxa"/>
             <w:vMerge w:val="restart"/>
           </w:tcPr>
-          <w:p>
+          <w:p ns2:paraId="5985F4D0" ns2:textId="77777777">
             <w:pPr>
               <w:spacing w:before="240"/>
               <w:jc w:val="center"/>
@@ -2379,7 +2379,7 @@
               <w:t xml:space="preserve">15-16 </w:t>
             </w:r>
           </w:p>
-          <w:p>
+          <w:p ns2:paraId="75048A8D" ns2:textId="77777777">
             <w:pPr>
               <w:spacing w:before="240"/>
               <w:jc w:val="center"/>
@@ -2396,7 +2396,7 @@
               <w:t>SEP</w:t>
             </w:r>
           </w:p>
-          <w:p>
+          <w:p ns2:paraId="7984AF1E" ns2:textId="3B48B3E6">
             <w:pPr>
               <w:spacing w:before="240"/>
               <w:jc w:val="center"/>
@@ -2419,7 +2419,7 @@
             <w:tcW w:w="1305" w:type="dxa"/>
             <w:vMerge w:val="restart"/>
           </w:tcPr>
-          <w:p>
+          <w:p ns2:paraId="723F0EE0" ns2:textId="3147FB08">
             <w:pPr>
               <w:spacing w:before="240"/>
               <w:jc w:val="center"/>
@@ -2446,7 +2446,7 @@
             <w:tcW w:w="1292" w:type="dxa"/>
             <w:vMerge w:val="restart"/>
           </w:tcPr>
-          <w:p>
+          <w:p ns2:paraId="782AA6AD" ns2:textId="149A46C1">
             <w:pPr>
               <w:spacing w:before="240"/>
               <w:jc w:val="center"/>
@@ -2469,13 +2469,13 @@
           </w:p>
         </w:tc>
       </w:tr>
-      <w:tr>
+      <w:tr ns2:paraId="1E95BB29" ns2:textId="77777777">
         <w:tc>
           <w:tcPr>
             <w:tcW w:w="851" w:type="dxa"/>
             <w:vMerge/>
           </w:tcPr>
-          <w:p>
+          <w:p ns2:paraId="4AB98AC5" ns2:textId="77777777">
             <w:pPr>
               <w:spacing w:before="240"/>
               <w:jc w:val="center"/>
@@ -2490,7 +2490,7 @@
           <w:tcPr>
             <w:tcW w:w="2153" w:type="dxa"/>
           </w:tcPr>
-          <w:p>
+          <w:p ns2:paraId="4B0D890C" ns2:textId="50EDC9F6">
             <w:pPr>
               <w:spacing w:before="240"/>
               <w:jc w:val="center"/>
@@ -2512,7 +2512,7 @@
           <w:tcPr>
             <w:tcW w:w="1576" w:type="dxa"/>
           </w:tcPr>
-          <w:p>
+          <w:p ns2:paraId="614F7743" ns2:textId="5D1BF043">
             <w:pPr>
               <w:spacing w:before="240"/>
               <w:jc w:val="center"/>
@@ -2535,7 +2535,7 @@
             <w:tcW w:w="2083" w:type="dxa"/>
             <w:vMerge/>
           </w:tcPr>
-          <w:p>
+          <w:p ns2:paraId="409F2061" ns2:textId="77777777">
             <w:pPr>
               <w:spacing w:before="240"/>
               <w:jc w:val="center"/>
@@ -2551,7 +2551,7 @@
             <w:tcW w:w="994" w:type="dxa"/>
             <w:vMerge/>
           </w:tcPr>
-          <w:p>
+          <w:p ns2:paraId="33A9F751" ns2:textId="77777777">
             <w:pPr>
               <w:spacing w:before="240"/>
               <w:jc w:val="center"/>
@@ -2567,7 +2567,7 @@
             <w:tcW w:w="1305" w:type="dxa"/>
             <w:vMerge/>
           </w:tcPr>
-          <w:p>
+          <w:p ns2:paraId="1A819C3F" ns2:textId="77777777">
             <w:pPr>
               <w:spacing w:before="240"/>
               <w:jc w:val="center"/>
@@ -2585,7 +2585,7 @@
             <w:tcW w:w="1292" w:type="dxa"/>
             <w:vMerge/>
           </w:tcPr>
-          <w:p>
+          <w:p ns2:paraId="7953CABD" ns2:textId="77777777">
             <w:pPr>
               <w:spacing w:before="240"/>
               <w:jc w:val="center"/>
@@ -2599,13 +2599,13 @@
           </w:p>
         </w:tc>
       </w:tr>
-      <w:tr>
+      <w:tr ns2:paraId="49C71F7D" ns2:textId="77777777">
         <w:tc>
           <w:tcPr>
             <w:tcW w:w="851" w:type="dxa"/>
             <w:vMerge/>
           </w:tcPr>
-          <w:p>
+          <w:p ns2:paraId="13CC819C" ns2:textId="77777777">
             <w:pPr>
               <w:spacing w:before="240"/>
               <w:jc w:val="center"/>
@@ -2620,7 +2620,7 @@
           <w:tcPr>
             <w:tcW w:w="2153" w:type="dxa"/>
           </w:tcPr>
-          <w:p>
+          <w:p ns2:paraId="2794E6BC" ns2:textId="6B413D11">
             <w:pPr>
               <w:spacing w:before="240"/>
               <w:jc w:val="center"/>
@@ -2642,7 +2642,7 @@
           <w:tcPr>
             <w:tcW w:w="1576" w:type="dxa"/>
           </w:tcPr>
-          <w:p>
+          <w:p ns2:paraId="16648275" ns2:textId="28FA2A3D">
             <w:pPr>
               <w:spacing w:before="240"/>
               <w:jc w:val="center"/>
@@ -2665,7 +2665,7 @@
             <w:tcW w:w="2083" w:type="dxa"/>
             <w:vMerge/>
           </w:tcPr>
-          <w:p>
+          <w:p ns2:paraId="28ED72E9" ns2:textId="77777777">
             <w:pPr>
               <w:spacing w:before="240"/>
               <w:jc w:val="center"/>
@@ -2681,7 +2681,7 @@
             <w:tcW w:w="994" w:type="dxa"/>
             <w:vMerge/>
           </w:tcPr>
-          <w:p>
+          <w:p ns2:paraId="385E1529" ns2:textId="77777777">
             <w:pPr>
               <w:spacing w:before="240"/>
               <w:jc w:val="center"/>
@@ -2697,7 +2697,7 @@
             <w:tcW w:w="1305" w:type="dxa"/>
             <w:vMerge/>
           </w:tcPr>
-          <w:p>
+          <w:p ns2:paraId="0C5E886F" ns2:textId="77777777">
             <w:pPr>
               <w:spacing w:before="240"/>
               <w:jc w:val="center"/>
@@ -2715,7 +2715,7 @@
             <w:tcW w:w="1292" w:type="dxa"/>
             <w:vMerge/>
           </w:tcPr>
-          <w:p>
+          <w:p ns2:paraId="21A4C931" ns2:textId="77777777">
             <w:pPr>
               <w:spacing w:before="240"/>
               <w:jc w:val="center"/>
@@ -2729,13 +2729,13 @@
           </w:p>
         </w:tc>
       </w:tr>
-      <w:tr>
+      <w:tr ns2:paraId="2DBA1DE2" ns2:textId="77777777">
         <w:tc>
           <w:tcPr>
             <w:tcW w:w="851" w:type="dxa"/>
             <w:vMerge/>
           </w:tcPr>
-          <w:p>
+          <w:p ns2:paraId="5D512209" ns2:textId="77777777">
             <w:pPr>
               <w:spacing w:before="240"/>
               <w:jc w:val="center"/>
@@ -2750,7 +2750,7 @@
           <w:tcPr>
             <w:tcW w:w="2153" w:type="dxa"/>
           </w:tcPr>
-          <w:p>
+          <w:p ns2:paraId="0C9393DB" ns2:textId="4D07F3A4">
             <w:pPr>
               <w:spacing w:before="240"/>
               <w:jc w:val="center"/>
@@ -2772,7 +2772,7 @@
           <w:tcPr>
             <w:tcW w:w="1576" w:type="dxa"/>
           </w:tcPr>
-          <w:p>
+          <w:p ns2:paraId="149BF135" ns2:textId="22550CE6">
             <w:pPr>
               <w:spacing w:before="240"/>
               <w:jc w:val="center"/>
@@ -2795,7 +2795,7 @@
             <w:tcW w:w="2083" w:type="dxa"/>
             <w:vMerge/>
           </w:tcPr>
-          <w:p>
+          <w:p ns2:paraId="3D813E05" ns2:textId="77777777">
             <w:pPr>
               <w:spacing w:before="240"/>
               <w:jc w:val="center"/>
@@ -2811,7 +2811,7 @@
             <w:tcW w:w="994" w:type="dxa"/>
             <w:vMerge/>
           </w:tcPr>
-          <w:p>
+          <w:p ns2:paraId="22350F66" ns2:textId="77777777">
             <w:pPr>
               <w:spacing w:before="240"/>
               <w:jc w:val="center"/>
@@ -2827,7 +2827,7 @@
             <w:tcW w:w="1305" w:type="dxa"/>
             <w:vMerge/>
           </w:tcPr>
-          <w:p>
+          <w:p ns2:paraId="689C7DC4" ns2:textId="77777777">
             <w:pPr>
               <w:spacing w:before="240"/>
               <w:jc w:val="center"/>
@@ -2845,7 +2845,7 @@
             <w:tcW w:w="1292" w:type="dxa"/>
             <w:vMerge/>
           </w:tcPr>
-          <w:p>
+          <w:p ns2:paraId="5691AD81" ns2:textId="77777777">
             <w:pPr>
               <w:spacing w:before="240"/>
               <w:jc w:val="center"/>
@@ -2859,13 +2859,13 @@
           </w:p>
         </w:tc>
       </w:tr>
-      <w:tr>
+      <w:tr ns2:paraId="05D62242" ns2:textId="77777777">
         <w:tc>
           <w:tcPr>
             <w:tcW w:w="851" w:type="dxa"/>
             <w:vMerge w:val="restart"/>
           </w:tcPr>
-          <w:p>
+          <w:p ns2:paraId="4B8A10A8" ns2:textId="13B8177B">
             <w:pPr>
               <w:spacing w:before="240"/>
               <w:jc w:val="center"/>
@@ -2888,7 +2888,7 @@
           <w:tcPr>
             <w:tcW w:w="2153" w:type="dxa"/>
           </w:tcPr>
-          <w:p>
+          <w:p ns2:paraId="0AADCE2F" ns2:textId="4AF9D864">
             <w:pPr>
               <w:spacing w:before="240" w:line="360" w:lineRule="auto"/>
               <w:jc w:val="center"/>
@@ -2910,7 +2910,7 @@
           <w:tcPr>
             <w:tcW w:w="1576" w:type="dxa"/>
           </w:tcPr>
-          <w:p>
+          <w:p ns2:paraId="48CB89AF" ns2:textId="411532A2">
             <w:pPr>
               <w:spacing w:before="240" w:line="360" w:lineRule="auto"/>
               <w:jc w:val="center"/>
@@ -2933,7 +2933,7 @@
             <w:tcW w:w="2083" w:type="dxa"/>
             <w:vMerge w:val="restart"/>
           </w:tcPr>
-          <w:p>
+          <w:p ns2:paraId="436DE9A6" ns2:textId="31943179">
             <w:pPr>
               <w:spacing w:before="240" w:line="360" w:lineRule="auto"/>
               <w:jc w:val="center"/>
@@ -2956,7 +2956,7 @@
             <w:tcW w:w="994" w:type="dxa"/>
             <w:vMerge w:val="restart"/>
           </w:tcPr>
-          <w:p>
+          <w:p ns2:paraId="77395C0C" ns2:textId="77777777">
             <w:pPr>
               <w:spacing w:before="240" w:line="360" w:lineRule="auto"/>
               <w:jc w:val="center"/>
@@ -2973,7 +2973,7 @@
               <w:t xml:space="preserve">21-22 AUG </w:t>
             </w:r>
           </w:p>
-          <w:p>
+          <w:p ns2:paraId="6AA94E6F" ns2:textId="1ABC84DE">
             <w:pPr>
               <w:spacing w:before="240" w:line="360" w:lineRule="auto"/>
               <w:jc w:val="center"/>
@@ -2996,7 +2996,7 @@
             <w:tcW w:w="1305" w:type="dxa"/>
             <w:vMerge w:val="restart"/>
           </w:tcPr>
-          <w:p>
+          <w:p ns2:paraId="7C32DCF3" ns2:textId="50A02A38">
             <w:pPr>
               <w:spacing w:before="240" w:line="360" w:lineRule="auto"/>
               <w:jc w:val="center"/>
@@ -3023,7 +3023,7 @@
             <w:tcW w:w="1292" w:type="dxa"/>
             <w:vMerge w:val="restart"/>
           </w:tcPr>
-          <w:p>
+          <w:p ns2:paraId="4653544F" ns2:textId="2BDD5B80">
             <w:pPr>
               <w:spacing w:before="240" w:line="360" w:lineRule="auto"/>
               <w:jc w:val="center"/>
@@ -3046,13 +3046,13 @@
           </w:p>
         </w:tc>
       </w:tr>
-      <w:tr>
+      <w:tr ns2:paraId="5AAF6D88" ns2:textId="77777777">
         <w:tc>
           <w:tcPr>
             <w:tcW w:w="851" w:type="dxa"/>
             <w:vMerge/>
           </w:tcPr>
-          <w:p>
+          <w:p ns2:paraId="11001F4F" ns2:textId="77777777">
             <w:pPr>
               <w:jc w:val="center"/>
               <w:rPr>
@@ -3066,7 +3066,7 @@
           <w:tcPr>
             <w:tcW w:w="2153" w:type="dxa"/>
           </w:tcPr>
-          <w:p>
+          <w:p ns2:paraId="4CBDD2F2" ns2:textId="7F5D12FF">
             <w:pPr>
               <w:spacing w:line="360" w:lineRule="auto"/>
               <w:jc w:val="center"/>
@@ -3088,7 +3088,7 @@
           <w:tcPr>
             <w:tcW w:w="1576" w:type="dxa"/>
           </w:tcPr>
-          <w:p>
+          <w:p ns2:paraId="29525F10" ns2:textId="094B2A75">
             <w:pPr>
               <w:spacing w:line="360" w:lineRule="auto"/>
               <w:jc w:val="center"/>
@@ -3111,7 +3111,7 @@
             <w:tcW w:w="2083" w:type="dxa"/>
             <w:vMerge/>
           </w:tcPr>
-          <w:p>
+          <w:p ns2:paraId="5815B7C9" ns2:textId="77777777">
             <w:pPr>
               <w:spacing w:line="360" w:lineRule="auto"/>
               <w:jc w:val="center"/>
@@ -3127,7 +3127,7 @@
             <w:tcW w:w="994" w:type="dxa"/>
             <w:vMerge/>
           </w:tcPr>
-          <w:p>
+          <w:p ns2:paraId="54388517" ns2:textId="77777777">
             <w:pPr>
               <w:spacing w:line="360" w:lineRule="auto"/>
               <w:jc w:val="center"/>
@@ -3143,7 +3143,7 @@
             <w:tcW w:w="1305" w:type="dxa"/>
             <w:vMerge/>
           </w:tcPr>
-          <w:p>
+          <w:p ns2:paraId="1756B2DA" ns2:textId="77777777">
             <w:pPr>
               <w:spacing w:line="360" w:lineRule="auto"/>
               <w:jc w:val="center"/>
@@ -3159,7 +3159,7 @@
             <w:tcW w:w="1292" w:type="dxa"/>
             <w:vMerge/>
           </w:tcPr>
-          <w:p>
+          <w:p ns2:paraId="74181375" ns2:textId="77777777">
             <w:pPr>
               <w:spacing w:line="360" w:lineRule="auto"/>
               <w:jc w:val="center"/>
@@ -3171,13 +3171,13 @@
           </w:p>
         </w:tc>
       </w:tr>
-      <w:tr>
+      <w:tr ns2:paraId="3C534FBF" ns2:textId="77777777">
         <w:tc>
           <w:tcPr>
             <w:tcW w:w="851" w:type="dxa"/>
             <w:vMerge/>
           </w:tcPr>
-          <w:p>
+          <w:p ns2:paraId="3AA75312" ns2:textId="77777777">
             <w:pPr>
               <w:jc w:val="center"/>
               <w:rPr>
@@ -3191,7 +3191,7 @@
           <w:tcPr>
             <w:tcW w:w="2153" w:type="dxa"/>
           </w:tcPr>
-          <w:p>
+          <w:p ns2:paraId="402AAD16" ns2:textId="7E007FB7">
             <w:pPr>
               <w:spacing w:line="360" w:lineRule="auto"/>
               <w:jc w:val="center"/>
@@ -3213,7 +3213,7 @@
           <w:tcPr>
             <w:tcW w:w="1576" w:type="dxa"/>
           </w:tcPr>
-          <w:p>
+          <w:p ns2:paraId="403EECC6" ns2:textId="23A881BA">
             <w:pPr>
               <w:spacing w:line="360" w:lineRule="auto"/>
               <w:jc w:val="center"/>
@@ -3236,7 +3236,7 @@
             <w:tcW w:w="2083" w:type="dxa"/>
             <w:vMerge/>
           </w:tcPr>
-          <w:p>
+          <w:p ns2:paraId="490E4238" ns2:textId="77777777">
             <w:pPr>
               <w:spacing w:line="360" w:lineRule="auto"/>
               <w:jc w:val="center"/>
@@ -3252,7 +3252,7 @@
             <w:tcW w:w="994" w:type="dxa"/>
             <w:vMerge/>
           </w:tcPr>
-          <w:p>
+          <w:p ns2:paraId="430F3376" ns2:textId="77777777">
             <w:pPr>
               <w:spacing w:line="360" w:lineRule="auto"/>
               <w:jc w:val="center"/>
@@ -3268,7 +3268,7 @@
             <w:tcW w:w="1305" w:type="dxa"/>
             <w:vMerge/>
           </w:tcPr>
-          <w:p>
+          <w:p ns2:paraId="39361CE5" ns2:textId="77777777">
             <w:pPr>
               <w:spacing w:line="360" w:lineRule="auto"/>
               <w:jc w:val="center"/>
@@ -3284,7 +3284,7 @@
             <w:tcW w:w="1292" w:type="dxa"/>
             <w:vMerge/>
           </w:tcPr>
-          <w:p>
+          <w:p ns2:paraId="6BFF4DA9" ns2:textId="77777777">
             <w:pPr>
               <w:spacing w:line="360" w:lineRule="auto"/>
               <w:jc w:val="center"/>
@@ -3296,13 +3296,13 @@
           </w:p>
         </w:tc>
       </w:tr>
-      <w:tr>
+      <w:tr ns2:paraId="01F989F8" ns2:textId="77777777">
         <w:tc>
           <w:tcPr>
             <w:tcW w:w="851" w:type="dxa"/>
             <w:vMerge w:val="restart"/>
           </w:tcPr>
-          <w:p>
+          <w:p ns2:paraId="40CC3B0C" ns2:textId="56C7F628">
             <w:pPr>
               <w:jc w:val="center"/>
               <w:rPr>
@@ -3323,7 +3323,7 @@
           <w:tcPr>
             <w:tcW w:w="2153" w:type="dxa"/>
           </w:tcPr>
-          <w:p>
+          <w:p ns2:paraId="760209BB" ns2:textId="7AFAE81D">
             <w:pPr>
               <w:spacing w:line="360" w:lineRule="auto"/>
               <w:jc w:val="center"/>
@@ -3345,7 +3345,7 @@
           <w:tcPr>
             <w:tcW w:w="1576" w:type="dxa"/>
           </w:tcPr>
-          <w:p>
+          <w:p ns2:paraId="473C4AFC" ns2:textId="3B68B35B">
             <w:pPr>
               <w:spacing w:line="360" w:lineRule="auto"/>
               <w:jc w:val="center"/>
@@ -3368,7 +3368,7 @@
             <w:tcW w:w="2083" w:type="dxa"/>
             <w:vMerge w:val="restart"/>
           </w:tcPr>
-          <w:p>
+          <w:p ns2:paraId="6F158FB8" ns2:textId="3928F5FB">
             <w:pPr>
               <w:spacing w:line="360" w:lineRule="auto"/>
               <w:jc w:val="center"/>
@@ -3391,7 +3391,7 @@
             <w:tcW w:w="994" w:type="dxa"/>
             <w:vMerge w:val="restart"/>
           </w:tcPr>
-          <w:p>
+          <w:p ns2:paraId="71F68A23" ns2:textId="77777777">
             <w:pPr>
               <w:spacing w:line="360" w:lineRule="auto"/>
               <w:jc w:val="center"/>
@@ -3408,7 +3408,7 @@
               <w:t>25 AUG</w:t>
             </w:r>
           </w:p>
-          <w:p>
+          <w:p ns2:paraId="29376E72" ns2:textId="2BAAD5F4">
             <w:pPr>
               <w:spacing w:line="360" w:lineRule="auto"/>
               <w:jc w:val="center"/>
@@ -3431,7 +3431,7 @@
             <w:tcW w:w="1305" w:type="dxa"/>
             <w:vMerge w:val="restart"/>
           </w:tcPr>
-          <w:p>
+          <w:p ns2:paraId="4E94D4C5" ns2:textId="294BB05B">
             <w:pPr>
               <w:spacing w:line="360" w:lineRule="auto"/>
               <w:jc w:val="center"/>
@@ -3458,7 +3458,7 @@
             <w:tcW w:w="1292" w:type="dxa"/>
             <w:vMerge w:val="restart"/>
           </w:tcPr>
-          <w:p>
+          <w:p ns2:paraId="3EB35CBD" ns2:textId="648C91ED">
             <w:pPr>
               <w:spacing w:line="360" w:lineRule="auto"/>
               <w:jc w:val="center"/>
@@ -3481,13 +3481,13 @@
           </w:p>
         </w:tc>
       </w:tr>
-      <w:tr>
+      <w:tr ns2:paraId="5FBBEF22" ns2:textId="77777777">
         <w:tc>
           <w:tcPr>
             <w:tcW w:w="851" w:type="dxa"/>
             <w:vMerge/>
           </w:tcPr>
-          <w:p>
+          <w:p ns2:paraId="13B22E51" ns2:textId="77777777">
             <w:pPr>
               <w:jc w:val="center"/>
               <w:rPr>
@@ -3501,7 +3501,7 @@
           <w:tcPr>
             <w:tcW w:w="2153" w:type="dxa"/>
           </w:tcPr>
-          <w:p>
+          <w:p ns2:paraId="35A79691" ns2:textId="13B0304D">
             <w:pPr>
               <w:spacing w:line="360" w:lineRule="auto"/>
               <w:jc w:val="center"/>
@@ -3523,7 +3523,7 @@
           <w:tcPr>
             <w:tcW w:w="1576" w:type="dxa"/>
           </w:tcPr>
-          <w:p>
+          <w:p ns2:paraId="79481AE7" ns2:textId="74037B0C">
             <w:pPr>
               <w:spacing w:line="360" w:lineRule="auto"/>
               <w:jc w:val="center"/>
@@ -3546,7 +3546,7 @@
             <w:tcW w:w="2083" w:type="dxa"/>
             <w:vMerge/>
           </w:tcPr>
-          <w:p>
+          <w:p ns2:paraId="5E3D1524" ns2:textId="77777777">
             <w:pPr>
               <w:spacing w:line="360" w:lineRule="auto"/>
               <w:jc w:val="center"/>
@@ -3562,7 +3562,7 @@
             <w:tcW w:w="994" w:type="dxa"/>
             <w:vMerge/>
           </w:tcPr>
-          <w:p>
+          <w:p ns2:paraId="6860DE6B" ns2:textId="77777777">
             <w:pPr>
               <w:spacing w:line="360" w:lineRule="auto"/>
               <w:jc w:val="center"/>
@@ -3578,7 +3578,7 @@
             <w:tcW w:w="1305" w:type="dxa"/>
             <w:vMerge/>
           </w:tcPr>
-          <w:p>
+          <w:p ns2:paraId="67418EA1" ns2:textId="77777777">
             <w:pPr>
               <w:spacing w:line="360" w:lineRule="auto"/>
               <w:jc w:val="center"/>
@@ -3594,7 +3594,7 @@
             <w:tcW w:w="1292" w:type="dxa"/>
             <w:vMerge/>
           </w:tcPr>
-          <w:p>
+          <w:p ns2:paraId="59099592" ns2:textId="77777777">
             <w:pPr>
               <w:spacing w:line="360" w:lineRule="auto"/>
               <w:jc w:val="center"/>
@@ -3606,13 +3606,13 @@
           </w:p>
         </w:tc>
       </w:tr>
-      <w:tr>
+      <w:tr ns2:paraId="05B2B821" ns2:textId="77777777">
         <w:tc>
           <w:tcPr>
             <w:tcW w:w="851" w:type="dxa"/>
             <w:vMerge/>
           </w:tcPr>
-          <w:p>
+          <w:p ns2:paraId="318B732A" ns2:textId="77777777">
             <w:pPr>
               <w:jc w:val="center"/>
               <w:rPr>
@@ -3626,7 +3626,7 @@
           <w:tcPr>
             <w:tcW w:w="2153" w:type="dxa"/>
           </w:tcPr>
-          <w:p>
+          <w:p ns2:paraId="4DCDECB2" ns2:textId="45E456A1">
             <w:pPr>
               <w:spacing w:line="360" w:lineRule="auto"/>
               <w:jc w:val="center"/>
@@ -3648,7 +3648,7 @@
           <w:tcPr>
             <w:tcW w:w="1576" w:type="dxa"/>
           </w:tcPr>
-          <w:p>
+          <w:p ns2:paraId="6FFE4BB7" ns2:textId="6E7166B7">
             <w:pPr>
               <w:spacing w:line="360" w:lineRule="auto"/>
               <w:jc w:val="center"/>
@@ -3671,7 +3671,7 @@
             <w:tcW w:w="2083" w:type="dxa"/>
             <w:vMerge/>
           </w:tcPr>
-          <w:p>
+          <w:p ns2:paraId="09ABB0A2" ns2:textId="77777777">
             <w:pPr>
               <w:spacing w:line="360" w:lineRule="auto"/>
               <w:jc w:val="center"/>
@@ -3687,7 +3687,7 @@
             <w:tcW w:w="994" w:type="dxa"/>
             <w:vMerge/>
           </w:tcPr>
-          <w:p>
+          <w:p ns2:paraId="1AA3E1CA" ns2:textId="77777777">
             <w:pPr>
               <w:spacing w:line="360" w:lineRule="auto"/>
               <w:jc w:val="center"/>
@@ -3703,7 +3703,7 @@
             <w:tcW w:w="1305" w:type="dxa"/>
             <w:vMerge/>
           </w:tcPr>
-          <w:p>
+          <w:p ns2:paraId="1C19B8EF" ns2:textId="77777777">
             <w:pPr>
               <w:spacing w:line="360" w:lineRule="auto"/>
               <w:jc w:val="center"/>
@@ -3719,7 +3719,7 @@
             <w:tcW w:w="1292" w:type="dxa"/>
             <w:vMerge/>
           </w:tcPr>
-          <w:p>
+          <w:p ns2:paraId="21D8654B" ns2:textId="77777777">
             <w:pPr>
               <w:spacing w:line="360" w:lineRule="auto"/>
               <w:jc w:val="center"/>
@@ -3731,13 +3731,13 @@
           </w:p>
         </w:tc>
       </w:tr>
-      <w:tr>
+      <w:tr ns2:paraId="5ED5D835" ns2:textId="77777777">
         <w:tc>
           <w:tcPr>
             <w:tcW w:w="851" w:type="dxa"/>
             <w:vMerge w:val="restart"/>
           </w:tcPr>
-          <w:p>
+          <w:p ns2:paraId="4D5ACEA3" ns2:textId="2C1EAE9E">
             <w:pPr>
               <w:jc w:val="center"/>
               <w:rPr>
@@ -3758,21 +3758,21 @@
           <w:tcPr>
             <w:tcW w:w="2153" w:type="dxa"/>
           </w:tcPr>
-          <w:p>
-            <w:pPr>
-              <w:spacing w:line="360" w:lineRule="auto"/>
-              <w:jc w:val="center"/>
-              <w:rPr>
-                <w:sz w:val="24"/>
-                <w:szCs w:val="24"/>
-              </w:rPr>
-            </w:pPr>
-            <w:r>
-              <w:rPr>
-                <w:sz w:val="24"/>
-                <w:szCs w:val="24"/>
-              </w:rPr>
-              <w:t>THEJASVANI S</w:t>
+          <w:p ns2:paraId="2FB621B3" ns2:textId="67282B12">
+            <w:pPr>
+              <w:spacing w:line="360" w:lineRule="auto"/>
+              <w:jc w:val="center"/>
+              <w:rPr>
+                <w:sz w:val="24"/>
+                <w:szCs w:val="24"/>
+              </w:rPr>
+            </w:pPr>
+            <w:r>
+              <w:rPr>
+                <w:sz w:val="24"/>
+                <w:szCs w:val="24"/>
+              </w:rPr>
+              <w:t>KAVIYA</w:t>
             </w:r>
           </w:p>
         </w:tc>
@@ -3780,21 +3780,21 @@
           <w:tcPr>
             <w:tcW w:w="1576" w:type="dxa"/>
           </w:tcPr>
-          <w:p>
-            <w:pPr>
-              <w:spacing w:line="360" w:lineRule="auto"/>
-              <w:jc w:val="center"/>
-              <w:rPr>
-                <w:sz w:val="24"/>
-                <w:szCs w:val="24"/>
-              </w:rPr>
-            </w:pPr>
-            <w:r>
-              <w:rPr>
-                <w:sz w:val="24"/>
-                <w:szCs w:val="24"/>
-              </w:rPr>
-              <w:t>CSE/III</w:t>
+          <w:p ns2:paraId="7937ABBD" ns2:textId="47CBFA93">
+            <w:pPr>
+              <w:spacing w:line="360" w:lineRule="auto"/>
+              <w:jc w:val="center"/>
+              <w:rPr>
+                <w:sz w:val="24"/>
+                <w:szCs w:val="24"/>
+              </w:rPr>
+            </w:pPr>
+            <w:r>
+              <w:rPr>
+                <w:sz w:val="24"/>
+                <w:szCs w:val="24"/>
+              </w:rPr>
+              <w:t>CSBS/III</w:t>
             </w:r>
           </w:p>
         </w:tc>
@@ -3803,7 +3803,7 @@
             <w:tcW w:w="2083" w:type="dxa"/>
             <w:vMerge w:val="restart"/>
           </w:tcPr>
-          <w:p>
+          <w:p ns2:paraId="67C45816" ns2:textId="2051CF61">
             <w:pPr>
               <w:spacing w:line="360" w:lineRule="auto"/>
               <w:jc w:val="center"/>
@@ -3826,7 +3826,7 @@
             <w:tcW w:w="994" w:type="dxa"/>
             <w:vMerge w:val="restart"/>
           </w:tcPr>
-          <w:p>
+          <w:p ns2:paraId="10336A8B" ns2:textId="77777777">
             <w:pPr>
               <w:spacing w:line="360" w:lineRule="auto"/>
               <w:jc w:val="center"/>
@@ -3843,7 +3843,7 @@
               <w:t>30</w:t>
             </w:r>
           </w:p>
-          <w:p>
+          <w:p ns2:paraId="72D6D91C" ns2:textId="77777777">
             <w:pPr>
               <w:spacing w:line="360" w:lineRule="auto"/>
               <w:jc w:val="center"/>
@@ -3860,7 +3860,7 @@
               <w:t>SEP</w:t>
             </w:r>
           </w:p>
-          <w:p>
+          <w:p ns2:paraId="72742984" ns2:textId="6E13203A">
             <w:pPr>
               <w:spacing w:line="360" w:lineRule="auto"/>
               <w:jc w:val="center"/>
@@ -3883,7 +3883,7 @@
             <w:tcW w:w="1305" w:type="dxa"/>
             <w:vMerge w:val="restart"/>
           </w:tcPr>
-          <w:p>
+          <w:p ns2:paraId="6D69B1E0" ns2:textId="14E2EE06">
             <w:pPr>
               <w:spacing w:line="360" w:lineRule="auto"/>
               <w:jc w:val="center"/>
@@ -3899,7 +3899,7 @@
                 <w:sz w:val="24"/>
                 <w:szCs w:val="24"/>
               </w:rPr>
-              <w:t>FIRST</w:t>
+              <w:t>SECOND</w:t>
             </w:r>
           </w:p>
         </w:tc>
@@ -3908,7 +3908,7 @@
             <w:tcW w:w="1292" w:type="dxa"/>
             <w:vMerge w:val="restart"/>
           </w:tcPr>
-          <w:p>
+          <w:p ns2:paraId="0AD9C136" ns2:textId="26E992E3">
             <w:pPr>
               <w:spacing w:line="360" w:lineRule="auto"/>
               <w:jc w:val="center"/>
@@ -3926,18 +3926,18 @@
                 <w:sz w:val="24"/>
                 <w:szCs w:val="24"/>
               </w:rPr>
-              <w:t>2000/-</w:t>
+              <w:t>1000/-</w:t>
             </w:r>
           </w:p>
         </w:tc>
       </w:tr>
-      <w:tr>
+      <w:tr ns2:paraId="248C47BB" ns2:textId="77777777">
         <w:tc>
           <w:tcPr>
             <w:tcW w:w="851" w:type="dxa"/>
             <w:vMerge/>
           </w:tcPr>
-          <w:p>
+          <w:p ns2:paraId="6B626879" ns2:textId="77777777">
             <w:pPr>
               <w:jc w:val="center"/>
               <w:rPr>
@@ -3951,21 +3951,21 @@
           <w:tcPr>
             <w:tcW w:w="2153" w:type="dxa"/>
           </w:tcPr>
-          <w:p>
-            <w:pPr>
-              <w:spacing w:line="360" w:lineRule="auto"/>
-              <w:jc w:val="center"/>
-              <w:rPr>
-                <w:sz w:val="24"/>
-                <w:szCs w:val="24"/>
-              </w:rPr>
-            </w:pPr>
-            <w:r>
-              <w:rPr>
-                <w:sz w:val="24"/>
-                <w:szCs w:val="24"/>
-              </w:rPr>
-              <w:t>VAISHNAVI DEVI G</w:t>
+          <w:p ns2:paraId="394ED22F" ns2:textId="28B5F93A">
+            <w:pPr>
+              <w:spacing w:line="360" w:lineRule="auto"/>
+              <w:jc w:val="center"/>
+              <w:rPr>
+                <w:sz w:val="24"/>
+                <w:szCs w:val="24"/>
+              </w:rPr>
+            </w:pPr>
+            <w:r>
+              <w:rPr>
+                <w:sz w:val="24"/>
+                <w:szCs w:val="24"/>
+              </w:rPr>
+              <w:t>SHANTHOSH</w:t>
             </w:r>
           </w:p>
         </w:tc>
@@ -3973,7 +3973,7 @@
           <w:tcPr>
             <w:tcW w:w="1576" w:type="dxa"/>
           </w:tcPr>
-          <w:p>
+          <w:p ns2:paraId="1FE22207" ns2:textId="5BE67068">
             <w:pPr>
               <w:spacing w:line="360" w:lineRule="auto"/>
               <w:jc w:val="center"/>
@@ -3996,7 +3996,7 @@
             <w:tcW w:w="2083" w:type="dxa"/>
             <w:vMerge/>
           </w:tcPr>
-          <w:p>
+          <w:p ns2:paraId="41402EED" ns2:textId="77777777">
             <w:pPr>
               <w:spacing w:line="360" w:lineRule="auto"/>
               <w:jc w:val="center"/>
@@ -4012,7 +4012,7 @@
             <w:tcW w:w="994" w:type="dxa"/>
             <w:vMerge/>
           </w:tcPr>
-          <w:p>
+          <w:p ns2:paraId="5654FF68" ns2:textId="77777777">
             <w:pPr>
               <w:spacing w:line="360" w:lineRule="auto"/>
               <w:jc w:val="center"/>
@@ -4028,7 +4028,7 @@
             <w:tcW w:w="1305" w:type="dxa"/>
             <w:vMerge/>
           </w:tcPr>
-          <w:p>
+          <w:p ns2:paraId="15D7134C" ns2:textId="77777777">
             <w:pPr>
               <w:spacing w:line="360" w:lineRule="auto"/>
               <w:jc w:val="center"/>
@@ -4044,13 +4044,11 @@
             <w:tcW w:w="1292" w:type="dxa"/>
             <w:vMerge/>
           </w:tcPr>
-          <w:p>
-            <w:pPr>
-              <w:spacing w:line="360" w:lineRule="auto"/>
-              <w:jc w:val="center"/>
-              <w:rPr>
-                <w:b/>
-                <w:bCs/>
+          <w:p ns2:paraId="770C0E44" ns2:textId="77777777">
+            <w:pPr>
+              <w:spacing w:line="360" w:lineRule="auto"/>
+              <w:jc w:val="center"/>
+              <w:rPr>
                 <w:sz w:val="24"/>
                 <w:szCs w:val="24"/>
               </w:rPr>
@@ -4058,13 +4056,13 @@
           </w:p>
         </w:tc>
       </w:tr>
-      <w:tr>
+      <w:tr ns2:paraId="59A3EDE1" ns2:textId="77777777">
         <w:tc>
           <w:tcPr>
             <w:tcW w:w="851" w:type="dxa"/>
             <w:vMerge/>
           </w:tcPr>
-          <w:p>
+          <w:p ns2:paraId="26E215B2" ns2:textId="77777777">
             <w:pPr>
               <w:jc w:val="center"/>
               <w:rPr>
@@ -4078,21 +4076,21 @@
           <w:tcPr>
             <w:tcW w:w="2153" w:type="dxa"/>
           </w:tcPr>
-          <w:p>
-            <w:pPr>
-              <w:spacing w:line="360" w:lineRule="auto"/>
-              <w:jc w:val="center"/>
-              <w:rPr>
-                <w:sz w:val="24"/>
-                <w:szCs w:val="24"/>
-              </w:rPr>
-            </w:pPr>
-            <w:r>
-              <w:rPr>
-                <w:sz w:val="24"/>
-                <w:szCs w:val="24"/>
-              </w:rPr>
-              <w:t>YOGITHA SG</w:t>
+          <w:p ns2:paraId="4A671CB7" ns2:textId="75AE1B4D">
+            <w:pPr>
+              <w:spacing w:line="360" w:lineRule="auto"/>
+              <w:jc w:val="center"/>
+              <w:rPr>
+                <w:sz w:val="24"/>
+                <w:szCs w:val="24"/>
+              </w:rPr>
+            </w:pPr>
+            <w:r>
+              <w:rPr>
+                <w:sz w:val="24"/>
+                <w:szCs w:val="24"/>
+              </w:rPr>
+              <w:t>Sakthi Priya</w:t>
             </w:r>
           </w:p>
         </w:tc>
@@ -4100,7 +4098,7 @@
           <w:tcPr>
             <w:tcW w:w="1576" w:type="dxa"/>
           </w:tcPr>
-          <w:p>
+          <w:p ns2:paraId="70C56428" ns2:textId="327336B3">
             <w:pPr>
               <w:spacing w:line="360" w:lineRule="auto"/>
               <w:jc w:val="center"/>
@@ -4123,7 +4121,7 @@
             <w:tcW w:w="2083" w:type="dxa"/>
             <w:vMerge/>
           </w:tcPr>
-          <w:p>
+          <w:p ns2:paraId="5FA03DE7" ns2:textId="77777777">
             <w:pPr>
               <w:spacing w:line="360" w:lineRule="auto"/>
               <w:jc w:val="center"/>
@@ -4139,7 +4137,7 @@
             <w:tcW w:w="994" w:type="dxa"/>
             <w:vMerge/>
           </w:tcPr>
-          <w:p>
+          <w:p ns2:paraId="2173AC00" ns2:textId="77777777">
             <w:pPr>
               <w:spacing w:line="360" w:lineRule="auto"/>
               <w:jc w:val="center"/>
@@ -4155,7 +4153,7 @@
             <w:tcW w:w="1305" w:type="dxa"/>
             <w:vMerge/>
           </w:tcPr>
-          <w:p>
+          <w:p ns2:paraId="6D9A30BF" ns2:textId="77777777">
             <w:pPr>
               <w:spacing w:line="360" w:lineRule="auto"/>
               <w:jc w:val="center"/>
@@ -4171,13 +4169,11 @@
             <w:tcW w:w="1292" w:type="dxa"/>
             <w:vMerge/>
           </w:tcPr>
-          <w:p>
-            <w:pPr>
-              <w:spacing w:line="360" w:lineRule="auto"/>
-              <w:jc w:val="center"/>
-              <w:rPr>
-                <w:b/>
-                <w:bCs/>
+          <w:p ns2:paraId="4F4D0ACB" ns2:textId="77777777">
+            <w:pPr>
+              <w:spacing w:line="360" w:lineRule="auto"/>
+              <w:jc w:val="center"/>
+              <w:rPr>
                 <w:sz w:val="24"/>
                 <w:szCs w:val="24"/>
               </w:rPr>
@@ -4185,13 +4181,138 @@
           </w:p>
         </w:tc>
       </w:tr>
-      <w:tr>
+      <w:tr ns2:paraId="7A5A54AF" ns2:textId="77777777">
+        <w:tc>
+          <w:tcPr>
+            <w:tcW w:w="851" w:type="dxa"/>
+            <w:vMerge/>
+          </w:tcPr>
+          <w:p ns2:paraId="2338C48C" ns2:textId="77777777">
+            <w:pPr>
+              <w:jc w:val="center"/>
+              <w:rPr>
+                <w:sz w:val="24"/>
+                <w:szCs w:val="24"/>
+              </w:rPr>
+            </w:pPr>
+          </w:p>
+        </w:tc>
+        <w:tc>
+          <w:tcPr>
+            <w:tcW w:w="2153" w:type="dxa"/>
+          </w:tcPr>
+          <w:p ns2:paraId="53D8F6B7" ns2:textId="4F6AB79C">
+            <w:pPr>
+              <w:spacing w:line="360" w:lineRule="auto"/>
+              <w:jc w:val="center"/>
+              <w:rPr>
+                <w:sz w:val="24"/>
+                <w:szCs w:val="24"/>
+              </w:rPr>
+            </w:pPr>
+            <w:r>
+              <w:rPr>
+                <w:sz w:val="24"/>
+                <w:szCs w:val="24"/>
+              </w:rPr>
+              <w:t>Yazhini</w:t>
+            </w:r>
+          </w:p>
+        </w:tc>
+        <w:tc>
+          <w:tcPr>
+            <w:tcW w:w="1576" w:type="dxa"/>
+          </w:tcPr>
+          <w:p ns2:paraId="457DABBD" ns2:textId="0906409B">
+            <w:pPr>
+              <w:spacing w:line="360" w:lineRule="auto"/>
+              <w:jc w:val="center"/>
+              <w:rPr>
+                <w:sz w:val="24"/>
+                <w:szCs w:val="24"/>
+              </w:rPr>
+            </w:pPr>
+            <w:r>
+              <w:rPr>
+                <w:sz w:val="24"/>
+                <w:szCs w:val="24"/>
+              </w:rPr>
+              <w:t>CSE/III</w:t>
+            </w:r>
+          </w:p>
+        </w:tc>
+        <w:tc>
+          <w:tcPr>
+            <w:tcW w:w="2083" w:type="dxa"/>
+            <w:vMerge/>
+          </w:tcPr>
+          <w:p ns2:paraId="013242A9" ns2:textId="77777777">
+            <w:pPr>
+              <w:spacing w:line="360" w:lineRule="auto"/>
+              <w:jc w:val="center"/>
+              <w:rPr>
+                <w:sz w:val="24"/>
+                <w:szCs w:val="24"/>
+              </w:rPr>
+            </w:pPr>
+          </w:p>
+        </w:tc>
+        <w:tc>
+          <w:tcPr>
+            <w:tcW w:w="994" w:type="dxa"/>
+            <w:vMerge/>
+          </w:tcPr>
+          <w:p ns2:paraId="00340E70" ns2:textId="77777777">
+            <w:pPr>
+              <w:spacing w:line="360" w:lineRule="auto"/>
+              <w:jc w:val="center"/>
+              <w:rPr>
+                <w:sz w:val="24"/>
+                <w:szCs w:val="24"/>
+              </w:rPr>
+            </w:pPr>
+          </w:p>
+        </w:tc>
+        <w:tc>
+          <w:tcPr>
+            <w:tcW w:w="1305" w:type="dxa"/>
+            <w:vMerge/>
+          </w:tcPr>
+          <w:p ns2:paraId="681A8546" ns2:textId="77777777">
+            <w:pPr>
+              <w:spacing w:line="360" w:lineRule="auto"/>
+              <w:jc w:val="center"/>
+              <w:rPr>
+                <w:sz w:val="24"/>
+                <w:szCs w:val="24"/>
+              </w:rPr>
+            </w:pPr>
+          </w:p>
+        </w:tc>
+        <w:tc>
+          <w:tcPr>
+            <w:tcW w:w="1292" w:type="dxa"/>
+            <w:vMerge/>
+          </w:tcPr>
+          <w:p ns2:paraId="5C77C8AC" ns2:textId="77777777">
+            <w:pPr>
+              <w:spacing w:line="360" w:lineRule="auto"/>
+              <w:jc w:val="center"/>
+              <w:rPr>
+                <w:sz w:val="24"/>
+                <w:szCs w:val="24"/>
+              </w:rPr>
+            </w:pPr>
+          </w:p>
+        </w:tc>
+      </w:tr>
+      <w:tr ns2:paraId="71591AE6" ns2:textId="77777777">
         <w:tc>
           <w:tcPr>
             <w:tcW w:w="851" w:type="dxa"/>
             <w:vMerge w:val="restart"/>
           </w:tcPr>
-          <w:p>
+          <w:p ns2:paraId="53F39364" ns2:textId="11D40375">
             <w:pPr>
               <w:jc w:val="center"/>
               <w:rPr>
@@ -4212,7 +4333,7 @@
           <w:tcPr>
             <w:tcW w:w="2153" w:type="dxa"/>
           </w:tcPr>
-          <w:p>
+          <w:p ns2:paraId="426A4410" ns2:textId="488FACD0">
             <w:pPr>
               <w:spacing w:line="360" w:lineRule="auto"/>
               <w:jc w:val="center"/>
@@ -4234,7 +4355,7 @@
           <w:tcPr>
             <w:tcW w:w="1576" w:type="dxa"/>
           </w:tcPr>
-          <w:p>
+          <w:p ns2:paraId="01C1E066" ns2:textId="4AE57C75">
             <w:pPr>
               <w:spacing w:line="360" w:lineRule="auto"/>
               <w:jc w:val="center"/>
@@ -4257,21 +4378,21 @@
             <w:tcW w:w="2083" w:type="dxa"/>
             <w:vMerge w:val="restart"/>
           </w:tcPr>
-          <w:p>
-            <w:pPr>
-              <w:spacing w:line="360" w:lineRule="auto"/>
-              <w:jc w:val="center"/>
-              <w:rPr>
-                <w:sz w:val="24"/>
-                <w:szCs w:val="24"/>
-              </w:rPr>
-            </w:pPr>
-            <w:r>
-              <w:rPr>
-                <w:sz w:val="24"/>
-                <w:szCs w:val="24"/>
-              </w:rPr>
-              <w:t>HACK DAY GENESIS 2026</w:t>
+          <w:p ns2:paraId="05CA6095" ns2:textId="0E13AC22">
+            <w:pPr>
+              <w:spacing w:line="360" w:lineRule="auto"/>
+              <w:jc w:val="center"/>
+              <w:rPr>
+                <w:sz w:val="24"/>
+                <w:szCs w:val="24"/>
+              </w:rPr>
+            </w:pPr>
+            <w:r>
+              <w:rPr>
+                <w:sz w:val="24"/>
+                <w:szCs w:val="24"/>
+              </w:rPr>
+              <w:t>FUTURE FORGE 2K26</w:t>
             </w:r>
           </w:p>
         </w:tc>
@@ -4280,55 +4401,58 @@
             <w:tcW w:w="994" w:type="dxa"/>
             <w:vMerge w:val="restart"/>
           </w:tcPr>
-          <w:p>
-            <w:pPr>
-              <w:spacing w:line="360" w:lineRule="auto"/>
-              <w:jc w:val="center"/>
-              <w:rPr>
-                <w:sz w:val="24"/>
-                <w:szCs w:val="24"/>
-              </w:rPr>
-            </w:pPr>
-            <w:r>
-              <w:rPr>
-                <w:sz w:val="24"/>
-                <w:szCs w:val="24"/>
-              </w:rPr>
-              <w:t>30</w:t>
-            </w:r>
-          </w:p>
-          <w:p>
-            <w:pPr>
-              <w:spacing w:line="360" w:lineRule="auto"/>
-              <w:jc w:val="center"/>
-              <w:rPr>
-                <w:sz w:val="24"/>
-                <w:szCs w:val="24"/>
-              </w:rPr>
-            </w:pPr>
-            <w:r>
-              <w:rPr>
-                <w:sz w:val="24"/>
-                <w:szCs w:val="24"/>
-              </w:rPr>
-              <w:t>SEP</w:t>
-            </w:r>
-          </w:p>
-          <w:p>
-            <w:pPr>
-              <w:spacing w:line="360" w:lineRule="auto"/>
-              <w:jc w:val="center"/>
-              <w:rPr>
-                <w:sz w:val="24"/>
-                <w:szCs w:val="24"/>
-              </w:rPr>
-            </w:pPr>
-            <w:r>
-              <w:rPr>
-                <w:sz w:val="24"/>
-                <w:szCs w:val="24"/>
-              </w:rPr>
-              <w:t>2026</w:t>
+          <w:p ns2:paraId="3FE7D819" ns2:textId="6C7A3F7C">
+            <w:pPr>
+              <w:spacing w:line="360" w:lineRule="auto"/>
+              <w:jc w:val="center"/>
+              <w:rPr>
+                <w:sz w:val="24"/>
+                <w:szCs w:val="24"/>
+              </w:rPr>
+            </w:pPr>
+            <w:r>
+              <w:rPr>
+                <w:sz w:val="24"/>
+                <w:szCs w:val="24"/>
+              </w:rPr>
+              <w:t>5</w:t>
+            </w:r>
+            <w:r>
+              <w:rPr>
+                <w:sz w:val="24"/>
+                <w:szCs w:val="24"/>
+                <w:vertAlign w:val="superscript"/>
+              </w:rPr>
+              <w:t>TH</w:t>
+            </w:r>
+            <w:r>
+              <w:rPr>
+                <w:sz w:val="24"/>
+                <w:szCs w:val="24"/>
+              </w:rPr>
+              <w:t xml:space="preserve"> &amp; 6</w:t>
+            </w:r>
+            <w:r>
+              <w:rPr>
+                <w:sz w:val="24"/>
+                <w:szCs w:val="24"/>
+                <w:vertAlign w:val="superscript"/>
+              </w:rPr>
+              <w:t>TH</w:t>
+            </w:r>
+            <w:r>
+              <w:rPr>
+                <w:sz w:val="24"/>
+                <w:szCs w:val="24"/>
+              </w:rPr>
+              <w:t xml:space="preserve"> </w:t>
+            </w:r>
+            <w:r>
+              <w:rPr>
+                <w:sz w:val="24"/>
+                <w:szCs w:val="24"/>
+              </w:rPr>
+              <w:t>OCT 2026</w:t>
             </w:r>
           </w:p>
         </w:tc>
@@ -4337,19 +4461,17 @@
             <w:tcW w:w="1305" w:type="dxa"/>
             <w:vMerge w:val="restart"/>
           </w:tcPr>
-          <w:p>
-            <w:pPr>
-              <w:spacing w:line="360" w:lineRule="auto"/>
-              <w:jc w:val="center"/>
-              <w:rPr>
-                <w:sz w:val="24"/>
-                <w:szCs w:val="24"/>
-              </w:rPr>
-            </w:pPr>
-            <w:r>
-              <w:rPr>
-                <w:b/>
-                <w:bCs/>
+          <w:p ns2:paraId="3C5A08BF" ns2:textId="114610D9">
+            <w:pPr>
+              <w:spacing w:line="360" w:lineRule="auto"/>
+              <w:jc w:val="center"/>
+              <w:rPr>
+                <w:sz w:val="24"/>
+                <w:szCs w:val="24"/>
+              </w:rPr>
+            </w:pPr>
+            <w:r>
+              <w:rPr>
                 <w:sz w:val="24"/>
                 <w:szCs w:val="24"/>
               </w:rPr>
@@ -4362,36 +4484,32 @@
             <w:tcW w:w="1292" w:type="dxa"/>
             <w:vMerge w:val="restart"/>
           </w:tcPr>
-          <w:p>
-            <w:pPr>
-              <w:spacing w:line="360" w:lineRule="auto"/>
-              <w:jc w:val="center"/>
-              <w:rPr>
-                <w:b/>
-                <w:bCs/>
-                <w:sz w:val="24"/>
-                <w:szCs w:val="24"/>
-              </w:rPr>
-            </w:pPr>
-            <w:r>
-              <w:rPr>
-                <w:b/>
-                <w:bCs/>
-                <w:sz w:val="24"/>
-                <w:szCs w:val="24"/>
-              </w:rPr>
-              <w:t>1000/-</w:t>
+          <w:p ns2:paraId="650E517D" ns2:textId="6C503B54">
+            <w:pPr>
+              <w:spacing w:line="360" w:lineRule="auto"/>
+              <w:jc w:val="center"/>
+              <w:rPr>
+                <w:sz w:val="24"/>
+                <w:szCs w:val="24"/>
+              </w:rPr>
+            </w:pPr>
+            <w:r>
+              <w:rPr>
+                <w:sz w:val="24"/>
+                <w:szCs w:val="24"/>
+              </w:rPr>
+              <w:t>8000/-</w:t>
             </w:r>
           </w:p>
         </w:tc>
       </w:tr>
-      <w:tr>
+      <w:tr ns2:paraId="1EFED158" ns2:textId="77777777">
         <w:tc>
           <w:tcPr>
             <w:tcW w:w="851" w:type="dxa"/>
             <w:vMerge/>
           </w:tcPr>
-          <w:p>
+          <w:p ns2:paraId="5B6BCF8B" ns2:textId="77777777">
             <w:pPr>
               <w:jc w:val="center"/>
               <w:rPr>
@@ -4405,7 +4523,7 @@
           <w:tcPr>
             <w:tcW w:w="2153" w:type="dxa"/>
           </w:tcPr>
-          <w:p>
+          <w:p ns2:paraId="5205F497" ns2:textId="30B1E3B4">
             <w:pPr>
               <w:spacing w:line="360" w:lineRule="auto"/>
               <w:jc w:val="center"/>
@@ -4427,7 +4545,7 @@
           <w:tcPr>
             <w:tcW w:w="1576" w:type="dxa"/>
           </w:tcPr>
-          <w:p>
+          <w:p ns2:paraId="498530AD" ns2:textId="337935DA">
             <w:pPr>
               <w:spacing w:line="360" w:lineRule="auto"/>
               <w:jc w:val="center"/>
@@ -4450,7 +4568,7 @@
             <w:tcW w:w="2083" w:type="dxa"/>
             <w:vMerge/>
           </w:tcPr>
-          <w:p>
+          <w:p ns2:paraId="15A9454D" ns2:textId="77777777">
             <w:pPr>
               <w:spacing w:line="360" w:lineRule="auto"/>
               <w:jc w:val="center"/>
@@ -4466,7 +4584,7 @@
             <w:tcW w:w="994" w:type="dxa"/>
             <w:vMerge/>
           </w:tcPr>
-          <w:p>
+          <w:p ns2:paraId="19D45665" ns2:textId="77777777">
             <w:pPr>
               <w:spacing w:line="360" w:lineRule="auto"/>
               <w:jc w:val="center"/>
@@ -4482,7 +4600,7 @@
             <w:tcW w:w="1305" w:type="dxa"/>
             <w:vMerge/>
           </w:tcPr>
-          <w:p>
+          <w:p ns2:paraId="020315BF" ns2:textId="77777777">
             <w:pPr>
               <w:spacing w:line="360" w:lineRule="auto"/>
               <w:jc w:val="center"/>
@@ -4498,7 +4616,7 @@
             <w:tcW w:w="1292" w:type="dxa"/>
             <w:vMerge/>
           </w:tcPr>
-          <w:p>
+          <w:p ns2:paraId="4B65E494" ns2:textId="77777777">
             <w:pPr>
               <w:spacing w:line="360" w:lineRule="auto"/>
               <w:jc w:val="center"/>
@@ -4510,13 +4628,13 @@
           </w:p>
         </w:tc>
       </w:tr>
-      <w:tr>
+      <w:tr ns2:paraId="49A9DEAE" ns2:textId="77777777">
         <w:tc>
           <w:tcPr>
             <w:tcW w:w="851" w:type="dxa"/>
             <w:vMerge/>
           </w:tcPr>
-          <w:p>
+          <w:p ns2:paraId="34C31285" ns2:textId="77777777">
             <w:pPr>
               <w:jc w:val="center"/>
               <w:rPr>
@@ -4530,29 +4648,47 @@
           <w:tcPr>
             <w:tcW w:w="2153" w:type="dxa"/>
           </w:tcPr>
-          <w:p>
-            <w:pPr>
-              <w:spacing w:line="360" w:lineRule="auto"/>
-              <w:jc w:val="center"/>
-              <w:rPr>
-                <w:sz w:val="24"/>
-                <w:szCs w:val="24"/>
-              </w:rPr>
-            </w:pPr>
-            <w:r>
-              <w:rPr>
-                <w:sz w:val="24"/>
-                <w:szCs w:val="24"/>
-              </w:rPr>
-              <w:t>Sakthi Priya</w:t>
-            </w:r>
+          <w:p ns2:paraId="3AAA5A2C" ns2:textId="14D08977">
+            <w:pPr>
+              <w:spacing w:line="360" w:lineRule="auto"/>
+              <w:jc w:val="center"/>
+              <w:rPr>
+                <w:sz w:val="24"/>
+                <w:szCs w:val="24"/>
+              </w:rPr>
+            </w:pPr>
+            <w:proofErr w:type="spellStart"/>
+            <w:r>
+              <w:rPr>
+                <w:sz w:val="24"/>
+                <w:szCs w:val="24"/>
+              </w:rPr>
+              <w:t>Sakthi</w:t>
+            </w:r>
+            <w:proofErr w:type="spellEnd"/>
+            <w:r>
+              <w:rPr>
+                <w:sz w:val="24"/>
+                <w:szCs w:val="24"/>
+              </w:rPr>
+              <w:t xml:space="preserve"> </w:t>
+            </w:r>
+            <w:proofErr w:type="spellStart"/>
+            <w:r>
+              <w:rPr>
+                <w:sz w:val="24"/>
+                <w:szCs w:val="24"/>
+              </w:rPr>
+              <w:t>Priya</w:t>
+            </w:r>
+            <w:proofErr w:type="spellEnd"/>
           </w:p>
         </w:tc>
         <w:tc>
           <w:tcPr>
             <w:tcW w:w="1576" w:type="dxa"/>
           </w:tcPr>
-          <w:p>
+          <w:p ns2:paraId="34522C5E" ns2:textId="1F3652F4">
             <w:pPr>
               <w:spacing w:line="360" w:lineRule="auto"/>
               <w:jc w:val="center"/>
@@ -4575,7 +4711,7 @@
             <w:tcW w:w="2083" w:type="dxa"/>
             <w:vMerge/>
           </w:tcPr>
-          <w:p>
+          <w:p ns2:paraId="4F7CD895" ns2:textId="77777777">
             <w:pPr>
               <w:spacing w:line="360" w:lineRule="auto"/>
               <w:jc w:val="center"/>
@@ -4591,7 +4727,7 @@
             <w:tcW w:w="994" w:type="dxa"/>
             <w:vMerge/>
           </w:tcPr>
-          <w:p>
+          <w:p ns2:paraId="038D9C15" ns2:textId="77777777">
             <w:pPr>
               <w:spacing w:line="360" w:lineRule="auto"/>
               <w:jc w:val="center"/>
@@ -4607,7 +4743,7 @@
             <w:tcW w:w="1305" w:type="dxa"/>
             <w:vMerge/>
           </w:tcPr>
-          <w:p>
+          <w:p ns2:paraId="6AA97DD6" ns2:textId="77777777">
             <w:pPr>
               <w:spacing w:line="360" w:lineRule="auto"/>
               <w:jc w:val="center"/>
@@ -4623,7 +4759,7 @@
             <w:tcW w:w="1292" w:type="dxa"/>
             <w:vMerge/>
           </w:tcPr>
-          <w:p>
+          <w:p ns2:paraId="034D5B07" ns2:textId="77777777">
             <w:pPr>
               <w:spacing w:line="360" w:lineRule="auto"/>
               <w:jc w:val="center"/>
@@ -4635,13 +4771,13 @@
           </w:p>
         </w:tc>
       </w:tr>
-      <w:tr>
+      <w:tr ns2:paraId="771D8A83" ns2:textId="77777777">
         <w:tc>
           <w:tcPr>
             <w:tcW w:w="851" w:type="dxa"/>
             <w:vMerge/>
           </w:tcPr>
-          <w:p>
+          <w:p ns2:paraId="6BF87762" ns2:textId="77777777">
             <w:pPr>
               <w:jc w:val="center"/>
               <w:rPr>
@@ -4655,15 +4791,16 @@
           <w:tcPr>
             <w:tcW w:w="2153" w:type="dxa"/>
           </w:tcPr>
-          <w:p>
-            <w:pPr>
-              <w:spacing w:line="360" w:lineRule="auto"/>
-              <w:jc w:val="center"/>
-              <w:rPr>
-                <w:sz w:val="24"/>
-                <w:szCs w:val="24"/>
-              </w:rPr>
-            </w:pPr>
+          <w:p ns2:paraId="3608E39D" ns2:textId="4357C9B6">
+            <w:pPr>
+              <w:spacing w:line="360" w:lineRule="auto"/>
+              <w:jc w:val="center"/>
+              <w:rPr>
+                <w:sz w:val="24"/>
+                <w:szCs w:val="24"/>
+              </w:rPr>
+            </w:pPr>
+            <w:proofErr w:type="spellStart"/>
             <w:r>
               <w:rPr>
                 <w:sz w:val="24"/>
@@ -4671,13 +4808,14 @@
               </w:rPr>
               <w:t>Yazhini</w:t>
             </w:r>
+            <w:proofErr w:type="spellEnd"/>
           </w:p>
         </w:tc>
         <w:tc>
           <w:tcPr>
             <w:tcW w:w="1576" w:type="dxa"/>
           </w:tcPr>
-          <w:p>
+          <w:p ns2:paraId="0E10BF00" ns2:textId="19E22A5B">
             <w:pPr>
               <w:spacing w:line="360" w:lineRule="auto"/>
               <w:jc w:val="center"/>
@@ -4700,7 +4838,7 @@
             <w:tcW w:w="2083" w:type="dxa"/>
             <w:vMerge/>
           </w:tcPr>
-          <w:p>
+          <w:p ns2:paraId="337C28FC" ns2:textId="77777777">
             <w:pPr>
               <w:spacing w:line="360" w:lineRule="auto"/>
               <w:jc w:val="center"/>
@@ -4716,7 +4854,7 @@
             <w:tcW w:w="994" w:type="dxa"/>
             <w:vMerge/>
           </w:tcPr>
-          <w:p>
+          <w:p ns2:paraId="3D3D180D" ns2:textId="77777777">
             <w:pPr>
               <w:spacing w:line="360" w:lineRule="auto"/>
               <w:jc w:val="center"/>
@@ -4732,7 +4870,7 @@
             <w:tcW w:w="1305" w:type="dxa"/>
             <w:vMerge/>
           </w:tcPr>
-          <w:p>
+          <w:p ns2:paraId="6BD06FA8" ns2:textId="77777777">
             <w:pPr>
               <w:spacing w:line="360" w:lineRule="auto"/>
               <w:jc w:val="center"/>
@@ -4748,7 +4886,7 @@
             <w:tcW w:w="1292" w:type="dxa"/>
             <w:vMerge/>
           </w:tcPr>
-          <w:p>
+          <w:p ns2:paraId="36585E11" ns2:textId="77777777">
             <w:pPr>
               <w:spacing w:line="360" w:lineRule="auto"/>
               <w:jc w:val="center"/>
@@ -4760,605 +4898,13 @@
           </w:p>
         </w:tc>
       </w:tr>
-      <w:tr>
-        <w:tc>
-          <w:tcPr>
-            <w:tcW w:w="851" w:type="dxa"/>
-            <w:vMerge w:val="restart"/>
-          </w:tcPr>
-          <w:p>
-            <w:pPr>
-              <w:jc w:val="center"/>
-              <w:rPr>
-                <w:sz w:val="24"/>
-                <w:szCs w:val="24"/>
-              </w:rPr>
-            </w:pPr>
-            <w:r>
-              <w:rPr>
-                <w:sz w:val="24"/>
-                <w:szCs w:val="24"/>
-              </w:rPr>
-              <w:t>8</w:t>
-            </w:r>
-          </w:p>
-        </w:tc>
-        <w:tc>
-          <w:tcPr>
-            <w:tcW w:w="2153" w:type="dxa"/>
-          </w:tcPr>
-          <w:p>
-            <w:pPr>
-              <w:spacing w:line="360" w:lineRule="auto"/>
-              <w:jc w:val="center"/>
-              <w:rPr>
-                <w:sz w:val="24"/>
-                <w:szCs w:val="24"/>
-              </w:rPr>
-            </w:pPr>
-            <w:r>
-              <w:rPr>
-                <w:sz w:val="24"/>
-                <w:szCs w:val="24"/>
-              </w:rPr>
-              <w:t>KAVIYA</w:t>
-            </w:r>
-          </w:p>
-        </w:tc>
-        <w:tc>
-          <w:tcPr>
-            <w:tcW w:w="1576" w:type="dxa"/>
-          </w:tcPr>
-          <w:p>
-            <w:pPr>
-              <w:spacing w:line="360" w:lineRule="auto"/>
-              <w:jc w:val="center"/>
-              <w:rPr>
-                <w:sz w:val="24"/>
-                <w:szCs w:val="24"/>
-              </w:rPr>
-            </w:pPr>
-            <w:r>
-              <w:rPr>
-                <w:sz w:val="24"/>
-                <w:szCs w:val="24"/>
-              </w:rPr>
-              <w:t>CSBS/III</w:t>
-            </w:r>
-          </w:p>
-        </w:tc>
-        <w:tc>
-          <w:tcPr>
-            <w:tcW w:w="2083" w:type="dxa"/>
-            <w:vMerge w:val="restart"/>
-          </w:tcPr>
-          <w:p>
-            <w:pPr>
-              <w:spacing w:line="360" w:lineRule="auto"/>
-              <w:jc w:val="center"/>
-              <w:rPr>
-                <w:sz w:val="24"/>
-                <w:szCs w:val="24"/>
-              </w:rPr>
-            </w:pPr>
-            <w:r>
-              <w:rPr>
-                <w:sz w:val="24"/>
-                <w:szCs w:val="24"/>
-              </w:rPr>
-              <w:t>FUTURE FORGE 2K26</w:t>
-            </w:r>
-          </w:p>
-        </w:tc>
-        <w:tc>
-          <w:tcPr>
-            <w:tcW w:w="994" w:type="dxa"/>
-            <w:vMerge w:val="restart"/>
-          </w:tcPr>
-          <w:p>
-            <w:pPr>
-              <w:spacing w:line="360" w:lineRule="auto"/>
-              <w:jc w:val="center"/>
-              <w:rPr>
-                <w:sz w:val="24"/>
-                <w:szCs w:val="24"/>
-              </w:rPr>
-            </w:pPr>
-            <w:r>
-              <w:rPr>
-                <w:sz w:val="24"/>
-                <w:szCs w:val="24"/>
-              </w:rPr>
-              <w:t>5</w:t>
-            </w:r>
-            <w:r>
-              <w:rPr>
-                <w:sz w:val="24"/>
-                <w:szCs w:val="24"/>
-                <w:vertAlign w:val="superscript"/>
-              </w:rPr>
-              <w:t>TH</w:t>
-            </w:r>
-            <w:r>
-              <w:rPr>
-                <w:sz w:val="24"/>
-                <w:szCs w:val="24"/>
-              </w:rPr>
-              <w:t xml:space="preserve"> &amp; 6</w:t>
-            </w:r>
-            <w:r>
-              <w:rPr>
-                <w:sz w:val="24"/>
-                <w:szCs w:val="24"/>
-                <w:vertAlign w:val="superscript"/>
-              </w:rPr>
-              <w:t>TH</w:t>
-            </w:r>
-            <w:r>
-              <w:rPr>
-                <w:sz w:val="24"/>
-                <w:szCs w:val="24"/>
-              </w:rPr>
-              <w:t xml:space="preserve"> </w:t>
-            </w:r>
-            <w:r>
-              <w:rPr>
-                <w:sz w:val="24"/>
-                <w:szCs w:val="24"/>
-              </w:rPr>
-              <w:t>OCT 2026</w:t>
-            </w:r>
-          </w:p>
-        </w:tc>
-        <w:tc>
-          <w:tcPr>
-            <w:tcW w:w="1305" w:type="dxa"/>
-            <w:vMerge w:val="restart"/>
-          </w:tcPr>
-          <w:p>
-            <w:pPr>
-              <w:spacing w:line="360" w:lineRule="auto"/>
-              <w:jc w:val="center"/>
-              <w:rPr>
-                <w:sz w:val="24"/>
-                <w:szCs w:val="24"/>
-              </w:rPr>
-            </w:pPr>
-            <w:r>
-              <w:rPr>
-                <w:sz w:val="24"/>
-                <w:szCs w:val="24"/>
-              </w:rPr>
-              <w:t>SECOND</w:t>
-            </w:r>
-          </w:p>
-        </w:tc>
-        <w:tc>
-          <w:tcPr>
-            <w:tcW w:w="1292" w:type="dxa"/>
-            <w:vMerge w:val="restart"/>
-          </w:tcPr>
-          <w:p>
-            <w:pPr>
-              <w:spacing w:line="360" w:lineRule="auto"/>
-              <w:jc w:val="center"/>
-              <w:rPr>
-                <w:sz w:val="24"/>
-                <w:szCs w:val="24"/>
-              </w:rPr>
-            </w:pPr>
-            <w:r>
-              <w:rPr>
-                <w:sz w:val="24"/>
-                <w:szCs w:val="24"/>
-              </w:rPr>
-              <w:t>8000/-</w:t>
-            </w:r>
-          </w:p>
-        </w:tc>
-      </w:tr>
-      <w:tr>
-        <w:tc>
-          <w:tcPr>
-            <w:tcW w:w="851" w:type="dxa"/>
-            <w:vMerge/>
-          </w:tcPr>
-          <w:p>
-            <w:pPr>
-              <w:jc w:val="center"/>
-              <w:rPr>
-                <w:sz w:val="24"/>
-                <w:szCs w:val="24"/>
-              </w:rPr>
-            </w:pPr>
-          </w:p>
-        </w:tc>
-        <w:tc>
-          <w:tcPr>
-            <w:tcW w:w="2153" w:type="dxa"/>
-          </w:tcPr>
-          <w:p>
-            <w:pPr>
-              <w:spacing w:line="360" w:lineRule="auto"/>
-              <w:jc w:val="center"/>
-              <w:rPr>
-                <w:sz w:val="24"/>
-                <w:szCs w:val="24"/>
-              </w:rPr>
-            </w:pPr>
-            <w:r>
-              <w:rPr>
-                <w:sz w:val="24"/>
-                <w:szCs w:val="24"/>
-              </w:rPr>
-              <w:t>SHANTHOSH</w:t>
-            </w:r>
-          </w:p>
-        </w:tc>
-        <w:tc>
-          <w:tcPr>
-            <w:tcW w:w="1576" w:type="dxa"/>
-          </w:tcPr>
-          <w:p>
-            <w:pPr>
-              <w:spacing w:line="360" w:lineRule="auto"/>
-              <w:jc w:val="center"/>
-              <w:rPr>
-                <w:sz w:val="24"/>
-                <w:szCs w:val="24"/>
-              </w:rPr>
-            </w:pPr>
-            <w:r>
-              <w:rPr>
-                <w:sz w:val="24"/>
-                <w:szCs w:val="24"/>
-              </w:rPr>
-              <w:t>CSE/III</w:t>
-            </w:r>
-          </w:p>
-        </w:tc>
-        <w:tc>
-          <w:tcPr>
-            <w:tcW w:w="2083" w:type="dxa"/>
-            <w:vMerge/>
-          </w:tcPr>
-          <w:p>
-            <w:pPr>
-              <w:spacing w:line="360" w:lineRule="auto"/>
-              <w:jc w:val="center"/>
-              <w:rPr>
-                <w:sz w:val="24"/>
-                <w:szCs w:val="24"/>
-              </w:rPr>
-            </w:pPr>
-          </w:p>
-        </w:tc>
-        <w:tc>
-          <w:tcPr>
-            <w:tcW w:w="994" w:type="dxa"/>
-            <w:vMerge/>
-          </w:tcPr>
-          <w:p>
-            <w:pPr>
-              <w:spacing w:line="360" w:lineRule="auto"/>
-              <w:jc w:val="center"/>
-              <w:rPr>
-                <w:sz w:val="24"/>
-                <w:szCs w:val="24"/>
-              </w:rPr>
-            </w:pPr>
-          </w:p>
-        </w:tc>
-        <w:tc>
-          <w:tcPr>
-            <w:tcW w:w="1305" w:type="dxa"/>
-            <w:vMerge/>
-          </w:tcPr>
-          <w:p>
-            <w:pPr>
-              <w:spacing w:line="360" w:lineRule="auto"/>
-              <w:jc w:val="center"/>
-              <w:rPr>
-                <w:sz w:val="24"/>
-                <w:szCs w:val="24"/>
-              </w:rPr>
-            </w:pPr>
-          </w:p>
-        </w:tc>
-        <w:tc>
-          <w:tcPr>
-            <w:tcW w:w="1292" w:type="dxa"/>
-            <w:vMerge/>
-          </w:tcPr>
-          <w:p>
-            <w:pPr>
-              <w:spacing w:line="360" w:lineRule="auto"/>
-              <w:jc w:val="center"/>
-              <w:rPr>
-                <w:sz w:val="24"/>
-                <w:szCs w:val="24"/>
-              </w:rPr>
-            </w:pPr>
-          </w:p>
-        </w:tc>
-      </w:tr>
-      <w:tr>
-        <w:tc>
-          <w:tcPr>
-            <w:tcW w:w="851" w:type="dxa"/>
-            <w:vMerge/>
-          </w:tcPr>
-          <w:p>
-            <w:pPr>
-              <w:jc w:val="center"/>
-              <w:rPr>
-                <w:sz w:val="24"/>
-                <w:szCs w:val="24"/>
-              </w:rPr>
-            </w:pPr>
-          </w:p>
-        </w:tc>
-        <w:tc>
-          <w:tcPr>
-            <w:tcW w:w="2153" w:type="dxa"/>
-          </w:tcPr>
-          <w:p>
-            <w:pPr>
-              <w:spacing w:line="360" w:lineRule="auto"/>
-              <w:jc w:val="center"/>
-              <w:rPr>
-                <w:sz w:val="24"/>
-                <w:szCs w:val="24"/>
-              </w:rPr>
-            </w:pPr>
-            <w:proofErr w:type="spellStart"/>
-            <w:r>
-              <w:rPr>
-                <w:sz w:val="24"/>
-                <w:szCs w:val="24"/>
-              </w:rPr>
-              <w:t>Sakthi</w:t>
-            </w:r>
-            <w:proofErr w:type="spellEnd"/>
-            <w:r>
-              <w:rPr>
-                <w:sz w:val="24"/>
-                <w:szCs w:val="24"/>
-              </w:rPr>
-              <w:t xml:space="preserve"> </w:t>
-            </w:r>
-            <w:proofErr w:type="spellStart"/>
-            <w:r>
-              <w:rPr>
-                <w:sz w:val="24"/>
-                <w:szCs w:val="24"/>
-              </w:rPr>
-              <w:t>Priya</w:t>
-            </w:r>
-            <w:proofErr w:type="spellEnd"/>
-          </w:p>
-        </w:tc>
-        <w:tc>
-          <w:tcPr>
-            <w:tcW w:w="1576" w:type="dxa"/>
-          </w:tcPr>
-          <w:p>
-            <w:pPr>
-              <w:spacing w:line="360" w:lineRule="auto"/>
-              <w:jc w:val="center"/>
-              <w:rPr>
-                <w:sz w:val="24"/>
-                <w:szCs w:val="24"/>
-              </w:rPr>
-            </w:pPr>
-            <w:r>
-              <w:rPr>
-                <w:sz w:val="24"/>
-                <w:szCs w:val="24"/>
-              </w:rPr>
-              <w:t>CSE/III</w:t>
-            </w:r>
-          </w:p>
-        </w:tc>
-        <w:tc>
-          <w:tcPr>
-            <w:tcW w:w="2083" w:type="dxa"/>
-            <w:vMerge/>
-          </w:tcPr>
-          <w:p>
-            <w:pPr>
-              <w:spacing w:line="360" w:lineRule="auto"/>
-              <w:jc w:val="center"/>
-              <w:rPr>
-                <w:sz w:val="24"/>
-                <w:szCs w:val="24"/>
-              </w:rPr>
-            </w:pPr>
-          </w:p>
-        </w:tc>
-        <w:tc>
-          <w:tcPr>
-            <w:tcW w:w="994" w:type="dxa"/>
-            <w:vMerge/>
-          </w:tcPr>
-          <w:p>
-            <w:pPr>
-              <w:spacing w:line="360" w:lineRule="auto"/>
-              <w:jc w:val="center"/>
-              <w:rPr>
-                <w:sz w:val="24"/>
-                <w:szCs w:val="24"/>
-              </w:rPr>
-            </w:pPr>
-          </w:p>
-        </w:tc>
-        <w:tc>
-          <w:tcPr>
-            <w:tcW w:w="1305" w:type="dxa"/>
-            <w:vMerge/>
-          </w:tcPr>
-          <w:p>
-            <w:pPr>
-              <w:spacing w:line="360" w:lineRule="auto"/>
-              <w:jc w:val="center"/>
-              <w:rPr>
-                <w:sz w:val="24"/>
-                <w:szCs w:val="24"/>
-              </w:rPr>
-            </w:pPr>
-          </w:p>
-        </w:tc>
-        <w:tc>
-          <w:tcPr>
-            <w:tcW w:w="1292" w:type="dxa"/>
-            <w:vMerge/>
-          </w:tcPr>
-          <w:p>
-            <w:pPr>
-              <w:spacing w:line="360" w:lineRule="auto"/>
-              <w:jc w:val="center"/>
-              <w:rPr>
-                <w:sz w:val="24"/>
-                <w:szCs w:val="24"/>
-              </w:rPr>
-            </w:pPr>
-          </w:p>
-        </w:tc>
-      </w:tr>
-      <w:tr>
-        <w:tc>
-          <w:tcPr>
-            <w:tcW w:w="851" w:type="dxa"/>
-            <w:vMerge/>
-          </w:tcPr>
-          <w:p>
-            <w:pPr>
-              <w:jc w:val="center"/>
-              <w:rPr>
-                <w:sz w:val="24"/>
-                <w:szCs w:val="24"/>
-              </w:rPr>
-            </w:pPr>
-          </w:p>
-        </w:tc>
-        <w:tc>
-          <w:tcPr>
-            <w:tcW w:w="2153" w:type="dxa"/>
-          </w:tcPr>
-          <w:p>
-            <w:pPr>
-              <w:spacing w:line="360" w:lineRule="auto"/>
-              <w:jc w:val="center"/>
-              <w:rPr>
-                <w:sz w:val="24"/>
-                <w:szCs w:val="24"/>
-              </w:rPr>
-            </w:pPr>
-            <w:proofErr w:type="spellStart"/>
-            <w:r>
-              <w:rPr>
-                <w:sz w:val="24"/>
-                <w:szCs w:val="24"/>
-              </w:rPr>
-              <w:t>Yazhini</w:t>
-            </w:r>
-            <w:proofErr w:type="spellEnd"/>
-          </w:p>
-        </w:tc>
-        <w:tc>
-          <w:tcPr>
-            <w:tcW w:w="1576" w:type="dxa"/>
-          </w:tcPr>
-          <w:p>
-            <w:pPr>
-              <w:spacing w:line="360" w:lineRule="auto"/>
-              <w:jc w:val="center"/>
-              <w:rPr>
-                <w:sz w:val="24"/>
-                <w:szCs w:val="24"/>
-              </w:rPr>
-            </w:pPr>
-            <w:r>
-              <w:rPr>
-                <w:sz w:val="24"/>
-                <w:szCs w:val="24"/>
-              </w:rPr>
-              <w:t>CSE/III</w:t>
-            </w:r>
-          </w:p>
-        </w:tc>
-        <w:tc>
-          <w:tcPr>
-            <w:tcW w:w="2083" w:type="dxa"/>
-            <w:vMerge/>
-          </w:tcPr>
-          <w:p>
-            <w:pPr>
-              <w:spacing w:line="360" w:lineRule="auto"/>
-              <w:jc w:val="center"/>
-              <w:rPr>
-                <w:sz w:val="24"/>
-                <w:szCs w:val="24"/>
-              </w:rPr>
-            </w:pPr>
-          </w:p>
-        </w:tc>
-        <w:tc>
-          <w:tcPr>
-            <w:tcW w:w="994" w:type="dxa"/>
-            <w:vMerge/>
-          </w:tcPr>
-          <w:p>
-            <w:pPr>
-              <w:spacing w:line="360" w:lineRule="auto"/>
-              <w:jc w:val="center"/>
-              <w:rPr>
-                <w:sz w:val="24"/>
-                <w:szCs w:val="24"/>
-              </w:rPr>
-            </w:pPr>
-          </w:p>
-        </w:tc>
-        <w:tc>
-          <w:tcPr>
-            <w:tcW w:w="1305" w:type="dxa"/>
-            <w:vMerge/>
-          </w:tcPr>
-          <w:p>
-            <w:pPr>
-              <w:spacing w:line="360" w:lineRule="auto"/>
-              <w:jc w:val="center"/>
-              <w:rPr>
-                <w:sz w:val="24"/>
-                <w:szCs w:val="24"/>
-              </w:rPr>
-            </w:pPr>
-          </w:p>
-        </w:tc>
-        <w:tc>
-          <w:tcPr>
-            <w:tcW w:w="1292" w:type="dxa"/>
-            <w:vMerge/>
-          </w:tcPr>
-          <w:p>
-            <w:pPr>
-              <w:spacing w:line="360" w:lineRule="auto"/>
-              <w:jc w:val="center"/>
-              <w:rPr>
-                <w:sz w:val="24"/>
-                <w:szCs w:val="24"/>
-              </w:rPr>
-            </w:pPr>
-          </w:p>
-        </w:tc>
-      </w:tr>
-      <w:tr>
+      <w:tr ns2:paraId="0E89E7DE" ns2:textId="77777777">
         <w:tc>
           <w:tcPr>
             <w:tcW w:w="8962" w:type="dxa"/>
             <w:gridSpan w:val="6"/>
           </w:tcPr>
-          <w:p>
+          <w:p ns2:paraId="56F4CD64" ns2:textId="40AB65AE">
             <w:pPr>
               <w:spacing w:line="360" w:lineRule="auto"/>
               <w:jc w:val="right"/>
@@ -5382,7 +4928,7 @@
           <w:tcPr>
             <w:tcW w:w="1292" w:type="dxa"/>
           </w:tcPr>
-          <w:p>
+          <w:p ns2:paraId="08786A12" ns2:textId="0A55115C">
             <w:pPr>
               <w:spacing w:line="360" w:lineRule="auto"/>
               <w:jc w:val="center"/>
@@ -5398,13 +4944,13 @@
                 <w:sz w:val="32"/>
                 <w:szCs w:val="24"/>
               </w:rPr>
-              <w:t>96,000/-</w:t>
+              <w:t>94,000/-</w:t>
             </w:r>
           </w:p>
         </w:tc>
       </w:tr>
     </w:tbl>
-    <w:p>
+    <w:p ns2:paraId="56A27C55" ns2:textId="77777777">
       <w:pPr>
         <w:rPr>
           <w:sz w:val="40"/>

</xml_diff>